<commit_message>
feat: virtual threads, seguridad CI (SBOM/Trivy/Cosign/Dependabot), Loki+OTel, ShedLock
</commit_message>
<xml_diff>
--- a/BookPlus-Stack-Tecnologico.docx
+++ b/BookPlus-Stack-Tecnologico.docx
@@ -8445,6 +8445,407 @@
     </w:p>
     <w:p>
       <w:pPr>
+        <w:pStyle w:val="Heading2"/>
+      </w:pPr>
+      <w:r>
+        <w:rPr>
+          <w:rFonts w:ascii="Arial" w:cs="Arial" w:eastAsia="Arial" w:hAnsi="Arial"/>
+        </w:rPr>
+        <w:t xml:space="preserve">13.14 Virtual Threads (Java 21 / Project Loom)</w:t>
+      </w:r>
+    </w:p>
+    <w:p>
+      <w:pPr>
+        <w:spacing w:after="120" w:line="276"/>
+      </w:pPr>
+      <w:r>
+        <w:rPr>
+          <w:rFonts w:ascii="Arial" w:cs="Arial" w:eastAsia="Arial" w:hAnsi="Arial"/>
+          <w:b/>
+          <w:bCs/>
+        </w:rPr>
+        <w:t xml:space="preserve">Qué es: </w:t>
+      </w:r>
+      <w:r>
+        <w:rPr>
+          <w:rFonts w:ascii="Arial" w:cs="Arial" w:eastAsia="Arial" w:hAnsi="Arial"/>
+        </w:rPr>
+        <w:t xml:space="preserve">hilos ligeros gestionados por la JVM. Permiten atender miles de peticiones concurrentes con muy pocos recursos, sin reescribir el código a un modelo reactivo.</w:t>
+      </w:r>
+    </w:p>
+    <w:p>
+      <w:pPr>
+        <w:spacing w:after="120" w:line="276"/>
+      </w:pPr>
+      <w:r>
+        <w:rPr>
+          <w:rFonts w:ascii="Arial" w:cs="Arial" w:eastAsia="Arial" w:hAnsi="Arial"/>
+          <w:b/>
+          <w:bCs/>
+        </w:rPr>
+        <w:t xml:space="preserve">Cómo se integra: </w:t>
+      </w:r>
+      <w:r>
+        <w:rPr>
+          <w:rFonts w:ascii="Arial" w:cs="Arial" w:eastAsia="Arial" w:hAnsi="Arial"/>
+        </w:rPr>
+        <w:t xml:space="preserve">activados en los 8 servicios servlet con </w:t>
+      </w:r>
+      <w:r>
+        <w:rPr>
+          <w:rFonts w:ascii="Consolas" w:cs="Consolas" w:eastAsia="Consolas" w:hAnsi="Consolas"/>
+          <w:color w:val="4F46E5"/>
+        </w:rPr>
+        <w:t xml:space="preserve">spring.threads.virtual.enabled: true</w:t>
+      </w:r>
+      <w:r>
+        <w:rPr>
+          <w:rFonts w:ascii="Arial" w:cs="Arial" w:eastAsia="Arial" w:hAnsi="Arial"/>
+        </w:rPr>
+        <w:t xml:space="preserve">. Spring Boot 3.3 ejecuta cada petición en un virtual thread: más throughput bajo carga de I/O con el mismo código bloqueante de siempre. El gateway, al ser reactivo, no lo necesita.</w:t>
+      </w:r>
+    </w:p>
+    <w:p>
+      <w:pPr>
+        <w:pStyle w:val="Heading2"/>
+      </w:pPr>
+      <w:r>
+        <w:rPr>
+          <w:rFonts w:ascii="Arial" w:cs="Arial" w:eastAsia="Arial" w:hAnsi="Arial"/>
+        </w:rPr>
+        <w:t xml:space="preserve">13.15 Seguridad de la cadena de suministro</w:t>
+      </w:r>
+    </w:p>
+    <w:p>
+      <w:pPr>
+        <w:spacing w:after="120" w:line="276"/>
+      </w:pPr>
+      <w:r>
+        <w:rPr>
+          <w:rFonts w:ascii="Arial" w:cs="Arial" w:eastAsia="Arial" w:hAnsi="Arial"/>
+          <w:b/>
+          <w:bCs/>
+        </w:rPr>
+        <w:t xml:space="preserve">Qué es y por qué: </w:t>
+      </w:r>
+      <w:r>
+        <w:rPr>
+          <w:rFonts w:ascii="Arial" w:cs="Arial" w:eastAsia="Arial" w:hAnsi="Arial"/>
+        </w:rPr>
+        <w:t xml:space="preserve">los bancos auditan de qué está hecho el software y exigen detectar vulnerabilidades antes de desplegar. Se incorpora al CI/CD.</w:t>
+      </w:r>
+    </w:p>
+    <w:p>
+      <w:pPr>
+        <w:pStyle w:val="ListParagraph"/>
+        <w:numPr>
+          <w:ilvl w:val="0"/>
+          <w:numId w:val="2"/>
+        </w:numPr>
+        <w:spacing w:after="80" w:line="268"/>
+      </w:pPr>
+      <w:r>
+        <w:rPr>
+          <w:rFonts w:ascii="Arial" w:cs="Arial" w:eastAsia="Arial" w:hAnsi="Arial"/>
+          <w:b/>
+          <w:bCs/>
+        </w:rPr>
+        <w:t xml:space="preserve">SBOM (CycloneDX): </w:t>
+      </w:r>
+      <w:r>
+        <w:rPr>
+          <w:rFonts w:ascii="Arial" w:cs="Arial" w:eastAsia="Arial" w:hAnsi="Arial"/>
+        </w:rPr>
+        <w:t xml:space="preserve">inventario completo de dependencias generado en cada build (trazabilidad ante un CVE).</w:t>
+      </w:r>
+    </w:p>
+    <w:p>
+      <w:pPr>
+        <w:pStyle w:val="ListParagraph"/>
+        <w:numPr>
+          <w:ilvl w:val="0"/>
+          <w:numId w:val="2"/>
+        </w:numPr>
+        <w:spacing w:after="80" w:line="268"/>
+      </w:pPr>
+      <w:r>
+        <w:rPr>
+          <w:rFonts w:ascii="Arial" w:cs="Arial" w:eastAsia="Arial" w:hAnsi="Arial"/>
+          <w:b/>
+          <w:bCs/>
+        </w:rPr>
+        <w:t xml:space="preserve">Trivy: </w:t>
+      </w:r>
+      <w:r>
+        <w:rPr>
+          <w:rFonts w:ascii="Arial" w:cs="Arial" w:eastAsia="Arial" w:hAnsi="Arial"/>
+        </w:rPr>
+        <w:t xml:space="preserve">escaneo de vulnerabilidades, secretos y misconfiguraciones; los hallazgos van a la pestaña Security de GitHub.</w:t>
+      </w:r>
+    </w:p>
+    <w:p>
+      <w:pPr>
+        <w:pStyle w:val="ListParagraph"/>
+        <w:numPr>
+          <w:ilvl w:val="0"/>
+          <w:numId w:val="2"/>
+        </w:numPr>
+        <w:spacing w:after="80" w:line="268"/>
+      </w:pPr>
+      <w:r>
+        <w:rPr>
+          <w:rFonts w:ascii="Arial" w:cs="Arial" w:eastAsia="Arial" w:hAnsi="Arial"/>
+          <w:b/>
+          <w:bCs/>
+        </w:rPr>
+        <w:t xml:space="preserve">OWASP Dependency-Check: </w:t>
+      </w:r>
+      <w:r>
+        <w:rPr>
+          <w:rFonts w:ascii="Arial" w:cs="Arial" w:eastAsia="Arial" w:hAnsi="Arial"/>
+        </w:rPr>
+        <w:t xml:space="preserve">análisis de dependencias contra la base de CVEs.</w:t>
+      </w:r>
+    </w:p>
+    <w:p>
+      <w:pPr>
+        <w:pStyle w:val="ListParagraph"/>
+        <w:numPr>
+          <w:ilvl w:val="0"/>
+          <w:numId w:val="2"/>
+        </w:numPr>
+        <w:spacing w:after="80" w:line="268"/>
+      </w:pPr>
+      <w:r>
+        <w:rPr>
+          <w:rFonts w:ascii="Arial" w:cs="Arial" w:eastAsia="Arial" w:hAnsi="Arial"/>
+          <w:b/>
+          <w:bCs/>
+        </w:rPr>
+        <w:t xml:space="preserve">Cosign / Sigstore: </w:t>
+      </w:r>
+      <w:r>
+        <w:rPr>
+          <w:rFonts w:ascii="Arial" w:cs="Arial" w:eastAsia="Arial" w:hAnsi="Arial"/>
+        </w:rPr>
+        <w:t xml:space="preserve">firma keyless de cada imagen publicada en GHCR (anti-tampering).</w:t>
+      </w:r>
+    </w:p>
+    <w:p>
+      <w:pPr>
+        <w:pStyle w:val="ListParagraph"/>
+        <w:numPr>
+          <w:ilvl w:val="0"/>
+          <w:numId w:val="2"/>
+        </w:numPr>
+        <w:spacing w:after="80" w:line="268"/>
+      </w:pPr>
+      <w:r>
+        <w:rPr>
+          <w:rFonts w:ascii="Arial" w:cs="Arial" w:eastAsia="Arial" w:hAnsi="Arial"/>
+          <w:b/>
+          <w:bCs/>
+        </w:rPr>
+        <w:t xml:space="preserve">Dependabot: </w:t>
+      </w:r>
+      <w:r>
+        <w:rPr>
+          <w:rFonts w:ascii="Arial" w:cs="Arial" w:eastAsia="Arial" w:hAnsi="Arial"/>
+        </w:rPr>
+        <w:t xml:space="preserve">PRs automáticas de actualización de dependencias.</w:t>
+      </w:r>
+    </w:p>
+    <w:p>
+      <w:pPr>
+        <w:spacing w:after="120" w:line="276"/>
+      </w:pPr>
+      <w:r>
+        <w:rPr>
+          <w:rFonts w:ascii="Arial" w:cs="Arial" w:eastAsia="Arial" w:hAnsi="Arial"/>
+        </w:rPr>
+        <w:t xml:space="preserve">Junto con SonarCloud (código) y Vault (secretos), cubre las tres capas: código, dependencias e imágenes. Detalle en SECURITY.md.</w:t>
+      </w:r>
+    </w:p>
+    <w:p>
+      <w:pPr>
+        <w:pStyle w:val="Heading2"/>
+      </w:pPr>
+      <w:r>
+        <w:rPr>
+          <w:rFonts w:ascii="Arial" w:cs="Arial" w:eastAsia="Arial" w:hAnsi="Arial"/>
+        </w:rPr>
+        <w:t xml:space="preserve">13.16 Logs centralizados (Loki) y OpenTelemetry</w:t>
+      </w:r>
+    </w:p>
+    <w:p>
+      <w:pPr>
+        <w:spacing w:after="120" w:line="276"/>
+      </w:pPr>
+      <w:r>
+        <w:rPr>
+          <w:rFonts w:ascii="Arial" w:cs="Arial" w:eastAsia="Arial" w:hAnsi="Arial"/>
+          <w:b/>
+          <w:bCs/>
+        </w:rPr>
+        <w:t xml:space="preserve">Qué es: </w:t>
+      </w:r>
+      <w:r>
+        <w:rPr>
+          <w:rFonts w:ascii="Arial" w:cs="Arial" w:eastAsia="Arial" w:hAnsi="Arial"/>
+        </w:rPr>
+        <w:t xml:space="preserve">la tercera pata de la observabilidad. A las métricas (Prometheus) y las trazas (Zipkin) se suma la agregación de logs.</w:t>
+      </w:r>
+    </w:p>
+    <w:p>
+      <w:pPr>
+        <w:spacing w:after="120" w:line="276"/>
+      </w:pPr>
+      <w:r>
+        <w:rPr>
+          <w:rFonts w:ascii="Arial" w:cs="Arial" w:eastAsia="Arial" w:hAnsi="Arial"/>
+          <w:b/>
+          <w:bCs/>
+        </w:rPr>
+        <w:t xml:space="preserve">Cómo se integra: </w:t>
+      </w:r>
+      <w:r>
+        <w:rPr>
+          <w:rFonts w:ascii="Arial" w:cs="Arial" w:eastAsia="Arial" w:hAnsi="Arial"/>
+        </w:rPr>
+        <w:t xml:space="preserve">Promtail recoge los logs de todos los contenedores y los envía a </w:t>
+      </w:r>
+      <w:r>
+        <w:rPr>
+          <w:rFonts w:ascii="Arial" w:cs="Arial" w:eastAsia="Arial" w:hAnsi="Arial"/>
+          <w:b/>
+          <w:bCs/>
+        </w:rPr>
+        <w:t xml:space="preserve">Grafana Loki</w:t>
+      </w:r>
+      <w:r>
+        <w:rPr>
+          <w:rFonts w:ascii="Arial" w:cs="Arial" w:eastAsia="Arial" w:hAnsi="Arial"/>
+        </w:rPr>
+        <w:t xml:space="preserve">, ya conectado como datasource en Grafana, donde se correlacionan por </w:t>
+      </w:r>
+      <w:r>
+        <w:rPr>
+          <w:rFonts w:ascii="Consolas" w:cs="Consolas" w:eastAsia="Consolas" w:hAnsi="Consolas"/>
+          <w:color w:val="4F46E5"/>
+        </w:rPr>
+        <w:t xml:space="preserve">traceId</w:t>
+      </w:r>
+      <w:r>
+        <w:rPr>
+          <w:rFonts w:ascii="Arial" w:cs="Arial" w:eastAsia="Arial" w:hAnsi="Arial"/>
+        </w:rPr>
+        <w:t xml:space="preserve">. Además, un </w:t>
+      </w:r>
+      <w:r>
+        <w:rPr>
+          <w:rFonts w:ascii="Arial" w:cs="Arial" w:eastAsia="Arial" w:hAnsi="Arial"/>
+          <w:b/>
+          <w:bCs/>
+        </w:rPr>
+        <w:t xml:space="preserve">OpenTelemetry Collector</w:t>
+      </w:r>
+      <w:r>
+        <w:rPr>
+          <w:rFonts w:ascii="Arial" w:cs="Arial" w:eastAsia="Arial" w:hAnsi="Arial"/>
+        </w:rPr>
+        <w:t xml:space="preserve"> actúa como punto central neutral de telemetría (OTLP → Zipkin/Prometheus), preparando la migración al estándar OTel.</w:t>
+      </w:r>
+    </w:p>
+    <w:p>
+      <w:pPr>
+        <w:pStyle w:val="Heading2"/>
+      </w:pPr>
+      <w:r>
+        <w:rPr>
+          <w:rFonts w:ascii="Arial" w:cs="Arial" w:eastAsia="Arial" w:hAnsi="Arial"/>
+        </w:rPr>
+        <w:t xml:space="preserve">13.17 ShedLock — bloqueo distribuido de tareas</w:t>
+      </w:r>
+    </w:p>
+    <w:p>
+      <w:pPr>
+        <w:spacing w:after="120" w:line="276"/>
+      </w:pPr>
+      <w:r>
+        <w:rPr>
+          <w:rFonts w:ascii="Arial" w:cs="Arial" w:eastAsia="Arial" w:hAnsi="Arial"/>
+          <w:b/>
+          <w:bCs/>
+        </w:rPr>
+        <w:t xml:space="preserve">Qué es: </w:t>
+      </w:r>
+      <w:r>
+        <w:rPr>
+          <w:rFonts w:ascii="Arial" w:cs="Arial" w:eastAsia="Arial" w:hAnsi="Arial"/>
+        </w:rPr>
+        <w:t xml:space="preserve">cuando un servicio corre con varias réplicas, sus tareas </w:t>
+      </w:r>
+      <w:r>
+        <w:rPr>
+          <w:rFonts w:ascii="Consolas" w:cs="Consolas" w:eastAsia="Consolas" w:hAnsi="Consolas"/>
+          <w:color w:val="4F46E5"/>
+        </w:rPr>
+        <w:t xml:space="preserve">@Scheduled</w:t>
+      </w:r>
+      <w:r>
+        <w:rPr>
+          <w:rFonts w:ascii="Arial" w:cs="Arial" w:eastAsia="Arial" w:hAnsi="Arial"/>
+        </w:rPr>
+        <w:t xml:space="preserve"> se ejecutarían en todas a la vez. ShedLock usa un cerrojo compartido (una tabla en la BD) para que cada ejecución la haga una sola instancia.</w:t>
+      </w:r>
+    </w:p>
+    <w:p>
+      <w:pPr>
+        <w:spacing w:after="120" w:line="276"/>
+      </w:pPr>
+      <w:r>
+        <w:rPr>
+          <w:rFonts w:ascii="Arial" w:cs="Arial" w:eastAsia="Arial" w:hAnsi="Arial"/>
+          <w:b/>
+          <w:bCs/>
+        </w:rPr>
+        <w:t xml:space="preserve">Cómo se integra: </w:t>
+      </w:r>
+      <w:r>
+        <w:rPr>
+          <w:rFonts w:ascii="Arial" w:cs="Arial" w:eastAsia="Arial" w:hAnsi="Arial"/>
+        </w:rPr>
+        <w:t xml:space="preserve">en order-service, el outbox relay va anotado con </w:t>
+      </w:r>
+      <w:r>
+        <w:rPr>
+          <w:rFonts w:ascii="Consolas" w:cs="Consolas" w:eastAsia="Consolas" w:hAnsi="Consolas"/>
+          <w:color w:val="4F46E5"/>
+        </w:rPr>
+        <w:t xml:space="preserve">@SchedulerLock</w:t>
+      </w:r>
+      <w:r>
+        <w:rPr>
+          <w:rFonts w:ascii="Arial" w:cs="Arial" w:eastAsia="Arial" w:hAnsi="Arial"/>
+        </w:rPr>
+        <w:t xml:space="preserve">; el cerrojo vive en la tabla </w:t>
+      </w:r>
+      <w:r>
+        <w:rPr>
+          <w:rFonts w:ascii="Consolas" w:cs="Consolas" w:eastAsia="Consolas" w:hAnsi="Consolas"/>
+          <w:color w:val="4F46E5"/>
+        </w:rPr>
+        <w:t xml:space="preserve">shedlock</w:t>
+      </w:r>
+      <w:r>
+        <w:rPr>
+          <w:rFonts w:ascii="Arial" w:cs="Arial" w:eastAsia="Arial" w:hAnsi="Arial"/>
+        </w:rPr>
+        <w:t xml:space="preserve">. Es la corrección clave para escalar order horizontalmente sin duplicar la publicación de eventos.</w:t>
+      </w:r>
+    </w:p>
+    <w:p>
+      <w:pPr>
         <w:pStyle w:val="Heading1"/>
       </w:pPr>
       <w:r>
@@ -10983,6 +11384,150 @@
           <w:rFonts w:ascii="Arial" w:cs="Arial" w:eastAsia="Arial" w:hAnsi="Arial"/>
         </w:rPr>
         <w:t xml:space="preserve">ampliar los tests de integración con Testcontainers a los servicios del saga.</w:t>
+      </w:r>
+    </w:p>
+    <w:p>
+      <w:pPr>
+        <w:pStyle w:val="ListParagraph"/>
+        <w:numPr>
+          <w:ilvl w:val="0"/>
+          <w:numId w:val="2"/>
+        </w:numPr>
+        <w:spacing w:after="80" w:line="268"/>
+      </w:pPr>
+      <w:r>
+        <w:rPr>
+          <w:rFonts w:ascii="Arial" w:cs="Arial" w:eastAsia="Arial" w:hAnsi="Arial"/>
+          <w:b/>
+          <w:bCs/>
+        </w:rPr>
+        <w:t xml:space="preserve">Vault dynamic secrets: </w:t>
+      </w:r>
+      <w:r>
+        <w:rPr>
+          <w:rFonts w:ascii="Arial" w:cs="Arial" w:eastAsia="Arial" w:hAnsi="Arial"/>
+        </w:rPr>
+        <w:t xml:space="preserve">credenciales de base de datos temporales generadas y rotadas automáticamente por Vault.</w:t>
+      </w:r>
+    </w:p>
+    <w:p>
+      <w:pPr>
+        <w:pStyle w:val="ListParagraph"/>
+        <w:numPr>
+          <w:ilvl w:val="0"/>
+          <w:numId w:val="2"/>
+        </w:numPr>
+        <w:spacing w:after="80" w:line="268"/>
+      </w:pPr>
+      <w:r>
+        <w:rPr>
+          <w:rFonts w:ascii="Arial" w:cs="Arial" w:eastAsia="Arial" w:hAnsi="Arial"/>
+          <w:b/>
+          <w:bCs/>
+        </w:rPr>
+        <w:t xml:space="preserve">OWASP ZAP (DAST): </w:t>
+      </w:r>
+      <w:r>
+        <w:rPr>
+          <w:rFonts w:ascii="Arial" w:cs="Arial" w:eastAsia="Arial" w:hAnsi="Arial"/>
+        </w:rPr>
+        <w:t xml:space="preserve">escaneo dinámico de seguridad de la aplicación en ejecución dentro del CI.</w:t>
+      </w:r>
+    </w:p>
+    <w:p>
+      <w:pPr>
+        <w:pStyle w:val="ListParagraph"/>
+        <w:numPr>
+          <w:ilvl w:val="0"/>
+          <w:numId w:val="2"/>
+        </w:numPr>
+        <w:spacing w:after="80" w:line="268"/>
+      </w:pPr>
+      <w:r>
+        <w:rPr>
+          <w:rFonts w:ascii="Arial" w:cs="Arial" w:eastAsia="Arial" w:hAnsi="Arial"/>
+          <w:b/>
+          <w:bCs/>
+        </w:rPr>
+        <w:t xml:space="preserve">gRPC: </w:t>
+      </w:r>
+      <w:r>
+        <w:rPr>
+          <w:rFonts w:ascii="Arial" w:cs="Arial" w:eastAsia="Arial" w:hAnsi="Arial"/>
+        </w:rPr>
+        <w:t xml:space="preserve">comunicación interna servicio-a-servicio contract-first con Protobuf (binaria y de alto rendimiento).</w:t>
+      </w:r>
+    </w:p>
+    <w:p>
+      <w:pPr>
+        <w:pStyle w:val="ListParagraph"/>
+        <w:numPr>
+          <w:ilvl w:val="0"/>
+          <w:numId w:val="2"/>
+        </w:numPr>
+        <w:spacing w:after="80" w:line="268"/>
+      </w:pPr>
+      <w:r>
+        <w:rPr>
+          <w:rFonts w:ascii="Arial" w:cs="Arial" w:eastAsia="Arial" w:hAnsi="Arial"/>
+          <w:b/>
+          <w:bCs/>
+        </w:rPr>
+        <w:t xml:space="preserve">GraphQL (Spring for GraphQL): </w:t>
+      </w:r>
+      <w:r>
+        <w:rPr>
+          <w:rFonts w:ascii="Arial" w:cs="Arial" w:eastAsia="Arial" w:hAnsi="Arial"/>
+        </w:rPr>
+        <w:t xml:space="preserve">una API de agregación para el frontend, como alternativa/complemento al gateway REST.</w:t>
+      </w:r>
+    </w:p>
+    <w:p>
+      <w:pPr>
+        <w:pStyle w:val="ListParagraph"/>
+        <w:numPr>
+          <w:ilvl w:val="0"/>
+          <w:numId w:val="2"/>
+        </w:numPr>
+        <w:spacing w:after="80" w:line="268"/>
+      </w:pPr>
+      <w:r>
+        <w:rPr>
+          <w:rFonts w:ascii="Arial" w:cs="Arial" w:eastAsia="Arial" w:hAnsi="Arial"/>
+          <w:b/>
+          <w:bCs/>
+        </w:rPr>
+        <w:t xml:space="preserve">Event Sourcing completo: </w:t>
+      </w:r>
+      <w:r>
+        <w:rPr>
+          <w:rFonts w:ascii="Arial" w:cs="Arial" w:eastAsia="Arial" w:hAnsi="Arial"/>
+        </w:rPr>
+        <w:t xml:space="preserve">con un event store (Axon / EventStoreDB) en un agregado como el pedido.</w:t>
+      </w:r>
+    </w:p>
+    <w:p>
+      <w:pPr>
+        <w:pStyle w:val="ListParagraph"/>
+        <w:numPr>
+          <w:ilvl w:val="0"/>
+          <w:numId w:val="2"/>
+        </w:numPr>
+        <w:spacing w:after="80" w:line="268"/>
+      </w:pPr>
+      <w:r>
+        <w:rPr>
+          <w:rFonts w:ascii="Arial" w:cs="Arial" w:eastAsia="Arial" w:hAnsi="Arial"/>
+          <w:b/>
+          <w:bCs/>
+        </w:rPr>
+        <w:t xml:space="preserve">Chaos engineering: </w:t>
+      </w:r>
+      <w:r>
+        <w:rPr>
+          <w:rFonts w:ascii="Arial" w:cs="Arial" w:eastAsia="Arial" w:hAnsi="Arial"/>
+        </w:rPr>
+        <w:t xml:space="preserve">Chaos Monkey for Spring Boot para inyectar fallos y validar la resiliencia.</w:t>
       </w:r>
     </w:p>
     <w:p>

</xml_diff>

<commit_message>
feat(robustez): bloqueo optimista (@Version) en stock, pago y pedido
</commit_message>
<xml_diff>
--- a/BookPlus-Stack-Tecnologico.docx
+++ b/BookPlus-Stack-Tecnologico.docx
@@ -8934,6 +8934,94 @@
     </w:p>
     <w:p>
       <w:pPr>
+        <w:pStyle w:val="Heading2"/>
+      </w:pPr>
+      <w:r>
+        <w:rPr>
+          <w:rFonts w:ascii="Arial" w:cs="Arial" w:eastAsia="Arial" w:hAnsi="Arial"/>
+        </w:rPr>
+        <w:t xml:space="preserve">13.19 Bloqueo optimista (Optimistic Locking)</w:t>
+      </w:r>
+    </w:p>
+    <w:p>
+      <w:pPr>
+        <w:spacing w:after="120" w:line="276"/>
+      </w:pPr>
+      <w:r>
+        <w:rPr>
+          <w:rFonts w:ascii="Arial" w:cs="Arial" w:eastAsia="Arial" w:hAnsi="Arial"/>
+          <w:b/>
+          <w:bCs/>
+        </w:rPr>
+        <w:t xml:space="preserve">Qué es: </w:t>
+      </w:r>
+      <w:r>
+        <w:rPr>
+          <w:rFonts w:ascii="Arial" w:cs="Arial" w:eastAsia="Arial" w:hAnsi="Arial"/>
+        </w:rPr>
+        <w:t xml:space="preserve">bajo concurrencia, dos procesos pueden leer la misma fila, modificarla y guardarla casi a la vez; sin control, la segunda escritura pisa a la primera (lost update) — vender stock inexistente o cobrar dos veces. Cada entidad lleva una columna </w:t>
+      </w:r>
+      <w:r>
+        <w:rPr>
+          <w:rFonts w:ascii="Consolas" w:cs="Consolas" w:eastAsia="Consolas" w:hAnsi="Consolas"/>
+          <w:color w:val="4F46E5"/>
+        </w:rPr>
+        <w:t xml:space="preserve">version</w:t>
+      </w:r>
+      <w:r>
+        <w:rPr>
+          <w:rFonts w:ascii="Arial" w:cs="Arial" w:eastAsia="Arial" w:hAnsi="Arial"/>
+        </w:rPr>
+        <w:t xml:space="preserve"> que Hibernate incluye en el UPDATE: si otro proceso la cambió entre la lectura y la escritura, el update afecta 0 filas y se lanza OptimisticLockException, rechazando la operación de forma controlada en vez de corromper datos.</w:t>
+      </w:r>
+    </w:p>
+    <w:p>
+      <w:pPr>
+        <w:spacing w:after="120" w:line="276"/>
+      </w:pPr>
+      <w:r>
+        <w:rPr>
+          <w:rFonts w:ascii="Arial" w:cs="Arial" w:eastAsia="Arial" w:hAnsi="Arial"/>
+          <w:b/>
+          <w:bCs/>
+        </w:rPr>
+        <w:t xml:space="preserve">Cómo se integra: </w:t>
+      </w:r>
+      <w:r>
+        <w:rPr>
+          <w:rFonts w:ascii="Arial" w:cs="Arial" w:eastAsia="Arial" w:hAnsi="Arial"/>
+        </w:rPr>
+        <w:t xml:space="preserve">se aplica con </w:t>
+      </w:r>
+      <w:r>
+        <w:rPr>
+          <w:rFonts w:ascii="Consolas" w:cs="Consolas" w:eastAsia="Consolas" w:hAnsi="Consolas"/>
+          <w:color w:val="4F46E5"/>
+        </w:rPr>
+        <w:t xml:space="preserve">@Version</w:t>
+      </w:r>
+      <w:r>
+        <w:rPr>
+          <w:rFonts w:ascii="Arial" w:cs="Arial" w:eastAsia="Arial" w:hAnsi="Arial"/>
+        </w:rPr>
+        <w:t xml:space="preserve"> a los agregados donde la concurrencia importa — Stock (evita overselling), Payment (evita cobros pisados) y Order (estados). Cada uno con su migración de columna </w:t>
+      </w:r>
+      <w:r>
+        <w:rPr>
+          <w:rFonts w:ascii="Consolas" w:cs="Consolas" w:eastAsia="Consolas" w:hAnsi="Consolas"/>
+          <w:color w:val="4F46E5"/>
+        </w:rPr>
+        <w:t xml:space="preserve">version</w:t>
+      </w:r>
+      <w:r>
+        <w:rPr>
+          <w:rFonts w:ascii="Arial" w:cs="Arial" w:eastAsia="Arial" w:hAnsi="Arial"/>
+        </w:rPr>
+        <w:t xml:space="preserve"> y la versión hilada por el dominio y el mapper, para que el control funcione con el patrón hexagonal. Detalle en RESILIENCE-OPTIMISTIC-LOCKING.md.</w:t>
+      </w:r>
+    </w:p>
+    <w:p>
+      <w:pPr>
         <w:pStyle w:val="Heading1"/>
       </w:pPr>
       <w:r>
@@ -11446,6 +11534,101 @@
                 <w:szCs w:val="19"/>
               </w:rPr>
               <w:t xml:space="preserve">Aislar mensajes veneno sin bloquear ni perder eventos</w:t>
+            </w:r>
+          </w:p>
+        </w:tc>
+      </w:tr>
+      <w:tr>
+        <w:trPr>
+          <w:tblHeader w:val="false"/>
+        </w:trPr>
+        <w:tc>
+          <w:tcPr>
+            <w:tcW w:type="dxa" w:w="2500"/>
+            <w:tcBorders>
+              <w:top w:val="single" w:color="D1D5DB" w:sz="1"/>
+              <w:left w:val="single" w:color="D1D5DB" w:sz="1"/>
+              <w:bottom w:val="single" w:color="D1D5DB" w:sz="1"/>
+              <w:right w:val="single" w:color="D1D5DB" w:sz="1"/>
+            </w:tcBorders>
+            <w:tcMar>
+              <w:top w:type="dxa" w:w="60"/>
+              <w:left w:type="dxa" w:w="110"/>
+              <w:bottom w:type="dxa" w:w="60"/>
+              <w:right w:type="dxa" w:w="110"/>
+            </w:tcMar>
+          </w:tcPr>
+          <w:p>
+            <w:pPr>
+              <w:spacing w:after="0" w:line="264"/>
+            </w:pPr>
+            <w:r>
+              <w:rPr>
+                <w:rFonts w:ascii="Arial" w:cs="Arial" w:eastAsia="Arial" w:hAnsi="Arial"/>
+                <w:sz w:val="19"/>
+                <w:szCs w:val="19"/>
+              </w:rPr>
+              <w:t xml:space="preserve">Optimistic Locking</w:t>
+            </w:r>
+          </w:p>
+        </w:tc>
+        <w:tc>
+          <w:tcPr>
+            <w:tcW w:type="dxa" w:w="3700"/>
+            <w:tcBorders>
+              <w:top w:val="single" w:color="D1D5DB" w:sz="1"/>
+              <w:left w:val="single" w:color="D1D5DB" w:sz="1"/>
+              <w:bottom w:val="single" w:color="D1D5DB" w:sz="1"/>
+              <w:right w:val="single" w:color="D1D5DB" w:sz="1"/>
+            </w:tcBorders>
+            <w:tcMar>
+              <w:top w:type="dxa" w:w="60"/>
+              <w:left w:type="dxa" w:w="110"/>
+              <w:bottom w:type="dxa" w:w="60"/>
+              <w:right w:type="dxa" w:w="110"/>
+            </w:tcMar>
+          </w:tcPr>
+          <w:p>
+            <w:pPr>
+              <w:spacing w:after="0" w:line="264"/>
+            </w:pPr>
+            <w:r>
+              <w:rPr>
+                <w:rFonts w:ascii="Arial" w:cs="Arial" w:eastAsia="Arial" w:hAnsi="Arial"/>
+                <w:sz w:val="19"/>
+                <w:szCs w:val="19"/>
+              </w:rPr>
+              <w:t xml:space="preserve">@Version en Stock, Payment y Order</w:t>
+            </w:r>
+          </w:p>
+        </w:tc>
+        <w:tc>
+          <w:tcPr>
+            <w:tcW w:type="dxa" w:w="3160"/>
+            <w:tcBorders>
+              <w:top w:val="single" w:color="D1D5DB" w:sz="1"/>
+              <w:left w:val="single" w:color="D1D5DB" w:sz="1"/>
+              <w:bottom w:val="single" w:color="D1D5DB" w:sz="1"/>
+              <w:right w:val="single" w:color="D1D5DB" w:sz="1"/>
+            </w:tcBorders>
+            <w:tcMar>
+              <w:top w:type="dxa" w:w="60"/>
+              <w:left w:type="dxa" w:w="110"/>
+              <w:bottom w:type="dxa" w:w="60"/>
+              <w:right w:type="dxa" w:w="110"/>
+            </w:tcMar>
+          </w:tcPr>
+          <w:p>
+            <w:pPr>
+              <w:spacing w:after="0" w:line="264"/>
+            </w:pPr>
+            <w:r>
+              <w:rPr>
+                <w:rFonts w:ascii="Arial" w:cs="Arial" w:eastAsia="Arial" w:hAnsi="Arial"/>
+                <w:sz w:val="19"/>
+                <w:szCs w:val="19"/>
+              </w:rPr>
+              <w:t xml:space="preserve">Detectar escrituras concurrentes y evitar lost updates</w:t>
             </w:r>
           </w:p>
         </w:tc>

</xml_diff>

<commit_message>
feat(cart): idempotencia HTTP (Idempotency-Key) en checkout
- IdempotencyService (PROCEED/REPLAY/IN_PROGRESS) + IdempotencyStore (Redis con TTL)
- CartController lee Idempotency-Key: evita pedidos duplicados ante reintentos; 409 si en curso
- Unit test IdempotencyServiceTest; doc IDEMPOTENCY-HTTP.md y Word del stack (13.24)
</commit_message>
<xml_diff>
--- a/BookPlus-Stack-Tecnologico.docx
+++ b/BookPlus-Stack-Tecnologico.docx
@@ -9610,6 +9610,94 @@
     </w:p>
     <w:p>
       <w:pPr>
+        <w:pStyle w:val="Heading2"/>
+      </w:pPr>
+      <w:r>
+        <w:rPr>
+          <w:rFonts w:ascii="Arial" w:cs="Arial" w:eastAsia="Arial" w:hAnsi="Arial"/>
+        </w:rPr>
+        <w:t xml:space="preserve">13.24 Idempotencia HTTP (Idempotency-Key)</w:t>
+      </w:r>
+    </w:p>
+    <w:p>
+      <w:pPr>
+        <w:spacing w:after="120" w:line="276"/>
+      </w:pPr>
+      <w:r>
+        <w:rPr>
+          <w:rFonts w:ascii="Arial" w:cs="Arial" w:eastAsia="Arial" w:hAnsi="Arial"/>
+          <w:b/>
+          <w:bCs/>
+        </w:rPr>
+        <w:t xml:space="preserve">Qué es: </w:t>
+      </w:r>
+      <w:r>
+        <w:rPr>
+          <w:rFonts w:ascii="Arial" w:cs="Arial" w:eastAsia="Arial" w:hAnsi="Arial"/>
+        </w:rPr>
+        <w:t xml:space="preserve">en operaciones que mueven dinero o crean recursos, el cliente puede reintentar sin querer (timeout, doble clic, reintento del navegador) y duplicar el efecto — otro pedido, otro cargo. La idempotencia HTTP garantiza que la misma operación, repetida, produce un solo efecto. Es el patrón de las APIs de pago serias (Stripe, PayPal): el cliente envía una cabecera Idempotency-Key (un UUID) y el servidor asegura que esa clave se procesa una sola vez.</w:t>
+      </w:r>
+    </w:p>
+    <w:p>
+      <w:pPr>
+        <w:spacing w:after="120" w:line="276"/>
+      </w:pPr>
+      <w:r>
+        <w:rPr>
+          <w:rFonts w:ascii="Arial" w:cs="Arial" w:eastAsia="Arial" w:hAnsi="Arial"/>
+          <w:b/>
+          <w:bCs/>
+        </w:rPr>
+        <w:t xml:space="preserve">Cómo se integra: </w:t>
+      </w:r>
+      <w:r>
+        <w:rPr>
+          <w:rFonts w:ascii="Arial" w:cs="Arial" w:eastAsia="Arial" w:hAnsi="Arial"/>
+        </w:rPr>
+        <w:t xml:space="preserve">en </w:t>
+      </w:r>
+      <w:r>
+        <w:rPr>
+          <w:rFonts w:ascii="Consolas" w:cs="Consolas" w:eastAsia="Consolas" w:hAnsi="Consolas"/>
+          <w:color w:val="4F46E5"/>
+        </w:rPr>
+        <w:t xml:space="preserve">POST /api/v1/cart/checkout</w:t>
+      </w:r>
+      <w:r>
+        <w:rPr>
+          <w:rFonts w:ascii="Arial" w:cs="Arial" w:eastAsia="Arial" w:hAnsi="Arial"/>
+        </w:rPr>
+        <w:t xml:space="preserve">, un </w:t>
+      </w:r>
+      <w:r>
+        <w:rPr>
+          <w:rFonts w:ascii="Consolas" w:cs="Consolas" w:eastAsia="Consolas" w:hAnsi="Consolas"/>
+          <w:color w:val="4F46E5"/>
+        </w:rPr>
+        <w:t xml:space="preserve">IdempotencyService</w:t>
+      </w:r>
+      <w:r>
+        <w:rPr>
+          <w:rFonts w:ascii="Arial" w:cs="Arial" w:eastAsia="Arial" w:hAnsi="Arial"/>
+        </w:rPr>
+        <w:t xml:space="preserve"> decide entre PROCEED (primera vez), REPLAY (ya completado → devuelve 202 sin re-procesar) e IN_PROGRESS (otra petición en curso → 409). Las claves se guardan en </w:t>
+      </w:r>
+      <w:r>
+        <w:rPr>
+          <w:rFonts w:ascii="Consolas" w:cs="Consolas" w:eastAsia="Consolas" w:hAnsi="Consolas"/>
+          <w:color w:val="4F46E5"/>
+        </w:rPr>
+        <w:t xml:space="preserve">Redis</w:t>
+      </w:r>
+      <w:r>
+        <w:rPr>
+          <w:rFonts w:ascii="Arial" w:cs="Arial" w:eastAsia="Arial" w:hAnsi="Arial"/>
+        </w:rPr>
+        <w:t xml:space="preserve"> (ya presente) con TTL, así caducan solas y el límite es global entre réplicas; si el checkout falla, la clave se libera para reintentar. Complementa al Idempotent Consumer que ya existía en Kafka (defensa en profundidad). Verificado con un unit test. Detalle en IDEMPOTENCY-HTTP.md.</w:t>
+      </w:r>
+    </w:p>
+    <w:p>
+      <w:pPr>
         <w:pStyle w:val="Heading1"/>
       </w:pPr>
       <w:r>
@@ -12597,6 +12685,101 @@
                 <w:szCs w:val="19"/>
               </w:rPr>
               <w:t xml:space="preserve">Proteger datos personales cifrándolos de forma transparente</w:t>
+            </w:r>
+          </w:p>
+        </w:tc>
+      </w:tr>
+      <w:tr>
+        <w:trPr>
+          <w:tblHeader w:val="false"/>
+        </w:trPr>
+        <w:tc>
+          <w:tcPr>
+            <w:tcW w:type="dxa" w:w="2500"/>
+            <w:tcBorders>
+              <w:top w:val="single" w:color="D1D5DB" w:sz="1"/>
+              <w:left w:val="single" w:color="D1D5DB" w:sz="1"/>
+              <w:bottom w:val="single" w:color="D1D5DB" w:sz="1"/>
+              <w:right w:val="single" w:color="D1D5DB" w:sz="1"/>
+            </w:tcBorders>
+            <w:tcMar>
+              <w:top w:type="dxa" w:w="60"/>
+              <w:left w:type="dxa" w:w="110"/>
+              <w:bottom w:type="dxa" w:w="60"/>
+              <w:right w:type="dxa" w:w="110"/>
+            </w:tcMar>
+          </w:tcPr>
+          <w:p>
+            <w:pPr>
+              <w:spacing w:after="0" w:line="264"/>
+            </w:pPr>
+            <w:r>
+              <w:rPr>
+                <w:rFonts w:ascii="Arial" w:cs="Arial" w:eastAsia="Arial" w:hAnsi="Arial"/>
+                <w:sz w:val="19"/>
+                <w:szCs w:val="19"/>
+              </w:rPr>
+              <w:t xml:space="preserve">Idempotencia HTTP (Idempotency-Key)</w:t>
+            </w:r>
+          </w:p>
+        </w:tc>
+        <w:tc>
+          <w:tcPr>
+            <w:tcW w:type="dxa" w:w="3700"/>
+            <w:tcBorders>
+              <w:top w:val="single" w:color="D1D5DB" w:sz="1"/>
+              <w:left w:val="single" w:color="D1D5DB" w:sz="1"/>
+              <w:bottom w:val="single" w:color="D1D5DB" w:sz="1"/>
+              <w:right w:val="single" w:color="D1D5DB" w:sz="1"/>
+            </w:tcBorders>
+            <w:tcMar>
+              <w:top w:type="dxa" w:w="60"/>
+              <w:left w:type="dxa" w:w="110"/>
+              <w:bottom w:type="dxa" w:w="60"/>
+              <w:right w:type="dxa" w:w="110"/>
+            </w:tcMar>
+          </w:tcPr>
+          <w:p>
+            <w:pPr>
+              <w:spacing w:after="0" w:line="264"/>
+            </w:pPr>
+            <w:r>
+              <w:rPr>
+                <w:rFonts w:ascii="Arial" w:cs="Arial" w:eastAsia="Arial" w:hAnsi="Arial"/>
+                <w:sz w:val="19"/>
+                <w:szCs w:val="19"/>
+              </w:rPr>
+              <w:t xml:space="preserve">Checkout de cart (Redis + TTL)</w:t>
+            </w:r>
+          </w:p>
+        </w:tc>
+        <w:tc>
+          <w:tcPr>
+            <w:tcW w:type="dxa" w:w="3160"/>
+            <w:tcBorders>
+              <w:top w:val="single" w:color="D1D5DB" w:sz="1"/>
+              <w:left w:val="single" w:color="D1D5DB" w:sz="1"/>
+              <w:bottom w:val="single" w:color="D1D5DB" w:sz="1"/>
+              <w:right w:val="single" w:color="D1D5DB" w:sz="1"/>
+            </w:tcBorders>
+            <w:tcMar>
+              <w:top w:type="dxa" w:w="60"/>
+              <w:left w:type="dxa" w:w="110"/>
+              <w:bottom w:type="dxa" w:w="60"/>
+              <w:right w:type="dxa" w:w="110"/>
+            </w:tcMar>
+          </w:tcPr>
+          <w:p>
+            <w:pPr>
+              <w:spacing w:after="0" w:line="264"/>
+            </w:pPr>
+            <w:r>
+              <w:rPr>
+                <w:rFonts w:ascii="Arial" w:cs="Arial" w:eastAsia="Arial" w:hAnsi="Arial"/>
+                <w:sz w:val="19"/>
+                <w:szCs w:val="19"/>
+              </w:rPr>
+              <w:t xml:space="preserve">Evitar pedidos/cargos duplicados ante reintentos del cliente</w:t>
             </w:r>
           </w:p>
         </w:tc>

</xml_diff>

<commit_message>
feat(catalog): caché de dos niveles (Caffeine L1 + Redis L2)
</commit_message>
<xml_diff>
--- a/BookPlus-Stack-Tecnologico.docx
+++ b/BookPlus-Stack-Tecnologico.docx
@@ -9825,6 +9825,107 @@
     </w:p>
     <w:p>
       <w:pPr>
+        <w:pStyle w:val="Heading2"/>
+      </w:pPr>
+      <w:r>
+        <w:rPr>
+          <w:rFonts w:ascii="Arial" w:cs="Arial" w:eastAsia="Arial" w:hAnsi="Arial"/>
+        </w:rPr>
+        <w:t xml:space="preserve">13.26 Caché de dos niveles (Caffeine + Redis)</w:t>
+      </w:r>
+    </w:p>
+    <w:p>
+      <w:pPr>
+        <w:spacing w:after="120" w:line="276"/>
+      </w:pPr>
+      <w:r>
+        <w:rPr>
+          <w:rFonts w:ascii="Arial" w:cs="Arial" w:eastAsia="Arial" w:hAnsi="Arial"/>
+          <w:b/>
+          <w:bCs/>
+        </w:rPr>
+        <w:t xml:space="preserve">Qué es: </w:t>
+      </w:r>
+      <w:r>
+        <w:rPr>
+          <w:rFonts w:ascii="Arial" w:cs="Arial" w:eastAsia="Arial" w:hAnsi="Arial"/>
+        </w:rPr>
+        <w:t xml:space="preserve">el catálogo se lee mucho más de lo que se escribe, así que cachear los libros más consultados ahorra trabajo a la base de datos. Ya había caché en Redis; se añade un nivel más rápido delante: una near-cache en memoria del proceso con Caffeine. L1 (Caffeine) responde en nanosegundos sin red; L2 (Redis) es compartido entre réplicas y sobrevive a reinicios. Cada acierto en L1 evita un viaje a Redis, y cada acierto en L2 evita uno a la base de datos.</w:t>
+      </w:r>
+    </w:p>
+    <w:p>
+      <w:pPr>
+        <w:spacing w:after="120" w:line="276"/>
+      </w:pPr>
+      <w:r>
+        <w:rPr>
+          <w:rFonts w:ascii="Arial" w:cs="Arial" w:eastAsia="Arial" w:hAnsi="Arial"/>
+          <w:b/>
+          <w:bCs/>
+        </w:rPr>
+        <w:t xml:space="preserve">Cómo se integra: </w:t>
+      </w:r>
+      <w:r>
+        <w:rPr>
+          <w:rFonts w:ascii="Arial" w:cs="Arial" w:eastAsia="Arial" w:hAnsi="Arial"/>
+        </w:rPr>
+        <w:t xml:space="preserve">un </w:t>
+      </w:r>
+      <w:r>
+        <w:rPr>
+          <w:rFonts w:ascii="Consolas" w:cs="Consolas" w:eastAsia="Consolas" w:hAnsi="Consolas"/>
+          <w:color w:val="4F46E5"/>
+        </w:rPr>
+        <w:t xml:space="preserve">TwoLevelCacheAdapter</w:t>
+      </w:r>
+      <w:r>
+        <w:rPr>
+          <w:rFonts w:ascii="Arial" w:cs="Arial" w:eastAsia="Arial" w:hAnsi="Arial"/>
+        </w:rPr>
+        <w:t xml:space="preserve"> (</w:t>
+      </w:r>
+      <w:r>
+        <w:rPr>
+          <w:rFonts w:ascii="Consolas" w:cs="Consolas" w:eastAsia="Consolas" w:hAnsi="Consolas"/>
+          <w:color w:val="4F46E5"/>
+        </w:rPr>
+        <w:t xml:space="preserve">@Primary</w:t>
+      </w:r>
+      <w:r>
+        <w:rPr>
+          <w:rFonts w:ascii="Arial" w:cs="Arial" w:eastAsia="Arial" w:hAnsi="Arial"/>
+        </w:rPr>
+        <w:t xml:space="preserve">) implementa el mismo </w:t>
+      </w:r>
+      <w:r>
+        <w:rPr>
+          <w:rFonts w:ascii="Consolas" w:cs="Consolas" w:eastAsia="Consolas" w:hAnsi="Consolas"/>
+          <w:color w:val="4F46E5"/>
+        </w:rPr>
+        <w:t xml:space="preserve">CachePort</w:t>
+      </w:r>
+      <w:r>
+        <w:rPr>
+          <w:rFonts w:ascii="Arial" w:cs="Arial" w:eastAsia="Arial" w:hAnsi="Arial"/>
+        </w:rPr>
+        <w:t xml:space="preserve"> y envuelve al adaptador Redis: lee L1 → L2 (repoblando L1) → BD, y propaga escrituras/evicciones a ambos niveles. L1 está acotada (10.000 entradas, expiración a 5 min) con estadísticas para medir el hit ratio. La dependencia </w:t>
+      </w:r>
+      <w:r>
+        <w:rPr>
+          <w:rFonts w:ascii="Consolas" w:cs="Consolas" w:eastAsia="Consolas" w:hAnsi="Consolas"/>
+          <w:color w:val="4F46E5"/>
+        </w:rPr>
+        <w:t xml:space="preserve">caffeine</w:t>
+      </w:r>
+      <w:r>
+        <w:rPr>
+          <w:rFonts w:ascii="Arial" w:cs="Arial" w:eastAsia="Arial" w:hAnsi="Arial"/>
+        </w:rPr>
+        <w:t xml:space="preserve"> la versiona el BOM de Spring Boot. Sin cambios en el resto del código. Verificado con un unit test. Detalle en CACHE-MULTILEVEL.md.</w:t>
+      </w:r>
+    </w:p>
+    <w:p>
+      <w:pPr>
         <w:pStyle w:val="Heading1"/>
       </w:pPr>
       <w:r>
@@ -13002,6 +13103,101 @@
                 <w:szCs w:val="19"/>
               </w:rPr>
               <w:t xml:space="preserve">Activar/desactivar funciones en caliente sin desplegar</w:t>
+            </w:r>
+          </w:p>
+        </w:tc>
+      </w:tr>
+      <w:tr>
+        <w:trPr>
+          <w:tblHeader w:val="false"/>
+        </w:trPr>
+        <w:tc>
+          <w:tcPr>
+            <w:tcW w:type="dxa" w:w="2500"/>
+            <w:tcBorders>
+              <w:top w:val="single" w:color="D1D5DB" w:sz="1"/>
+              <w:left w:val="single" w:color="D1D5DB" w:sz="1"/>
+              <w:bottom w:val="single" w:color="D1D5DB" w:sz="1"/>
+              <w:right w:val="single" w:color="D1D5DB" w:sz="1"/>
+            </w:tcBorders>
+            <w:tcMar>
+              <w:top w:type="dxa" w:w="60"/>
+              <w:left w:type="dxa" w:w="110"/>
+              <w:bottom w:type="dxa" w:w="60"/>
+              <w:right w:type="dxa" w:w="110"/>
+            </w:tcMar>
+          </w:tcPr>
+          <w:p>
+            <w:pPr>
+              <w:spacing w:after="0" w:line="264"/>
+            </w:pPr>
+            <w:r>
+              <w:rPr>
+                <w:rFonts w:ascii="Arial" w:cs="Arial" w:eastAsia="Arial" w:hAnsi="Arial"/>
+                <w:sz w:val="19"/>
+                <w:szCs w:val="19"/>
+              </w:rPr>
+              <w:t xml:space="preserve">Near-cache (caché de 2 niveles)</w:t>
+            </w:r>
+          </w:p>
+        </w:tc>
+        <w:tc>
+          <w:tcPr>
+            <w:tcW w:type="dxa" w:w="3700"/>
+            <w:tcBorders>
+              <w:top w:val="single" w:color="D1D5DB" w:sz="1"/>
+              <w:left w:val="single" w:color="D1D5DB" w:sz="1"/>
+              <w:bottom w:val="single" w:color="D1D5DB" w:sz="1"/>
+              <w:right w:val="single" w:color="D1D5DB" w:sz="1"/>
+            </w:tcBorders>
+            <w:tcMar>
+              <w:top w:type="dxa" w:w="60"/>
+              <w:left w:type="dxa" w:w="110"/>
+              <w:bottom w:type="dxa" w:w="60"/>
+              <w:right w:type="dxa" w:w="110"/>
+            </w:tcMar>
+          </w:tcPr>
+          <w:p>
+            <w:pPr>
+              <w:spacing w:after="0" w:line="264"/>
+            </w:pPr>
+            <w:r>
+              <w:rPr>
+                <w:rFonts w:ascii="Arial" w:cs="Arial" w:eastAsia="Arial" w:hAnsi="Arial"/>
+                <w:sz w:val="19"/>
+                <w:szCs w:val="19"/>
+              </w:rPr>
+              <w:t xml:space="preserve">Caffeine (L1) + Redis (L2) en catalog</w:t>
+            </w:r>
+          </w:p>
+        </w:tc>
+        <w:tc>
+          <w:tcPr>
+            <w:tcW w:type="dxa" w:w="3160"/>
+            <w:tcBorders>
+              <w:top w:val="single" w:color="D1D5DB" w:sz="1"/>
+              <w:left w:val="single" w:color="D1D5DB" w:sz="1"/>
+              <w:bottom w:val="single" w:color="D1D5DB" w:sz="1"/>
+              <w:right w:val="single" w:color="D1D5DB" w:sz="1"/>
+            </w:tcBorders>
+            <w:tcMar>
+              <w:top w:type="dxa" w:w="60"/>
+              <w:left w:type="dxa" w:w="110"/>
+              <w:bottom w:type="dxa" w:w="60"/>
+              <w:right w:type="dxa" w:w="110"/>
+            </w:tcMar>
+          </w:tcPr>
+          <w:p>
+            <w:pPr>
+              <w:spacing w:after="0" w:line="264"/>
+            </w:pPr>
+            <w:r>
+              <w:rPr>
+                <w:rFonts w:ascii="Arial" w:cs="Arial" w:eastAsia="Arial" w:hAnsi="Arial"/>
+                <w:sz w:val="19"/>
+                <w:szCs w:val="19"/>
+              </w:rPr>
+              <w:t xml:space="preserve">Acelerar lecturas calientes evitando viajes de red</w:t>
             </w:r>
           </w:p>
         </w:tc>

</xml_diff>

<commit_message>
feat(auth): hashing de contraseñas con Argon2id (compatible con BCrypt)
- DelegatingPasswordEncoder: {argon2} por defecto, valida BCrypt heredado (con y sin prefijo)
- upgradeEncoding re-hashea a Argon2 en el próximo login; sin reset de contraseñas
- BouncyCastle 1.78.1 (requerido por Argon2PasswordEncoder)
- Unit test PasswordEncoderArgon2Test; doc + Word del stack (13.27)
</commit_message>
<xml_diff>
--- a/BookPlus-Stack-Tecnologico.docx
+++ b/BookPlus-Stack-Tecnologico.docx
@@ -9926,6 +9926,133 @@
     </w:p>
     <w:p>
       <w:pPr>
+        <w:pStyle w:val="Heading2"/>
+      </w:pPr>
+      <w:r>
+        <w:rPr>
+          <w:rFonts w:ascii="Arial" w:cs="Arial" w:eastAsia="Arial" w:hAnsi="Arial"/>
+        </w:rPr>
+        <w:t xml:space="preserve">13.27 Hashing de contraseñas con Argon2id</w:t>
+      </w:r>
+    </w:p>
+    <w:p>
+      <w:pPr>
+        <w:spacing w:after="120" w:line="276"/>
+      </w:pPr>
+      <w:r>
+        <w:rPr>
+          <w:rFonts w:ascii="Arial" w:cs="Arial" w:eastAsia="Arial" w:hAnsi="Arial"/>
+          <w:b/>
+          <w:bCs/>
+        </w:rPr>
+        <w:t xml:space="preserve">Qué es: </w:t>
+      </w:r>
+      <w:r>
+        <w:rPr>
+          <w:rFonts w:ascii="Arial" w:cs="Arial" w:eastAsia="Arial" w:hAnsi="Arial"/>
+        </w:rPr>
+        <w:t xml:space="preserve">las contraseñas se guardan hasheadas con un algoritmo lento y resistente a hardware especializado, para que una base de datos robada no permita probar millones de contraseñas por segundo. Se migra de BCrypt a Argon2id, el algoritmo recomendado hoy por OWASP: además de tiempo exige mucha memoria (memory-hard), lo que neutraliza el paralelismo masivo de GPUs/ASIC.</w:t>
+      </w:r>
+    </w:p>
+    <w:p>
+      <w:pPr>
+        <w:spacing w:after="120" w:line="276"/>
+      </w:pPr>
+      <w:r>
+        <w:rPr>
+          <w:rFonts w:ascii="Arial" w:cs="Arial" w:eastAsia="Arial" w:hAnsi="Arial"/>
+          <w:b/>
+          <w:bCs/>
+        </w:rPr>
+        <w:t xml:space="preserve">Cómo se integra: </w:t>
+      </w:r>
+      <w:r>
+        <w:rPr>
+          <w:rFonts w:ascii="Arial" w:cs="Arial" w:eastAsia="Arial" w:hAnsi="Arial"/>
+        </w:rPr>
+        <w:t xml:space="preserve">en auth-service, </w:t>
+      </w:r>
+      <w:r>
+        <w:rPr>
+          <w:rFonts w:ascii="Consolas" w:cs="Consolas" w:eastAsia="Consolas" w:hAnsi="Consolas"/>
+          <w:color w:val="4F46E5"/>
+        </w:rPr>
+        <w:t xml:space="preserve">SecurityConfig.passwordEncoder()</w:t>
+      </w:r>
+      <w:r>
+        <w:rPr>
+          <w:rFonts w:ascii="Arial" w:cs="Arial" w:eastAsia="Arial" w:hAnsi="Arial"/>
+        </w:rPr>
+        <w:t xml:space="preserve"> devuelve un </w:t>
+      </w:r>
+      <w:r>
+        <w:rPr>
+          <w:rFonts w:ascii="Consolas" w:cs="Consolas" w:eastAsia="Consolas" w:hAnsi="Consolas"/>
+          <w:color w:val="4F46E5"/>
+        </w:rPr>
+        <w:t xml:space="preserve">DelegatingPasswordEncoder</w:t>
+      </w:r>
+      <w:r>
+        <w:rPr>
+          <w:rFonts w:ascii="Arial" w:cs="Arial" w:eastAsia="Arial" w:hAnsi="Arial"/>
+        </w:rPr>
+        <w:t xml:space="preserve"> con Argon2id por defecto (</w:t>
+      </w:r>
+      <w:r>
+        <w:rPr>
+          <w:rFonts w:ascii="Consolas" w:cs="Consolas" w:eastAsia="Consolas" w:hAnsi="Consolas"/>
+          <w:color w:val="4F46E5"/>
+        </w:rPr>
+        <w:t xml:space="preserve">{argon2}</w:t>
+      </w:r>
+      <w:r>
+        <w:rPr>
+          <w:rFonts w:ascii="Arial" w:cs="Arial" w:eastAsia="Arial" w:hAnsi="Arial"/>
+        </w:rPr>
+        <w:t xml:space="preserve">) que sigue validando los hashes BCrypt existentes (con prefijo y los heredados sin prefijo, vía </w:t>
+      </w:r>
+      <w:r>
+        <w:rPr>
+          <w:rFonts w:ascii="Consolas" w:cs="Consolas" w:eastAsia="Consolas" w:hAnsi="Consolas"/>
+          <w:color w:val="4F46E5"/>
+        </w:rPr>
+        <w:t xml:space="preserve">defaultPasswordEncoderForMatches</w:t>
+      </w:r>
+      <w:r>
+        <w:rPr>
+          <w:rFonts w:ascii="Arial" w:cs="Arial" w:eastAsia="Arial" w:hAnsi="Arial"/>
+        </w:rPr>
+        <w:t xml:space="preserve">). Así la migración es gradual y sin fricción: nadie resetea su contraseña y </w:t>
+      </w:r>
+      <w:r>
+        <w:rPr>
+          <w:rFonts w:ascii="Consolas" w:cs="Consolas" w:eastAsia="Consolas" w:hAnsi="Consolas"/>
+          <w:color w:val="4F46E5"/>
+        </w:rPr>
+        <w:t xml:space="preserve">upgradeEncoding</w:t>
+      </w:r>
+      <w:r>
+        <w:rPr>
+          <w:rFonts w:ascii="Arial" w:cs="Arial" w:eastAsia="Arial" w:hAnsi="Arial"/>
+        </w:rPr>
+        <w:t xml:space="preserve"> re-hashea a Argon2 en el próximo login. Requiere BouncyCastle (versionado por Spring Boot). Todo el código ya usaba el bean </w:t>
+      </w:r>
+      <w:r>
+        <w:rPr>
+          <w:rFonts w:ascii="Consolas" w:cs="Consolas" w:eastAsia="Consolas" w:hAnsi="Consolas"/>
+          <w:color w:val="4F46E5"/>
+        </w:rPr>
+        <w:t xml:space="preserve">PasswordEncoder</w:t>
+      </w:r>
+      <w:r>
+        <w:rPr>
+          <w:rFonts w:ascii="Arial" w:cs="Arial" w:eastAsia="Arial" w:hAnsi="Arial"/>
+        </w:rPr>
+        <w:t xml:space="preserve">, así que no hubo más cambios. Verificado con un unit test. Detalle en PASSWORD-HASHING-ARGON2.md.</w:t>
+      </w:r>
+    </w:p>
+    <w:p>
+      <w:pPr>
         <w:pStyle w:val="Heading1"/>
       </w:pPr>
       <w:r>
@@ -13198,6 +13325,101 @@
                 <w:szCs w:val="19"/>
               </w:rPr>
               <w:t xml:space="preserve">Acelerar lecturas calientes evitando viajes de red</w:t>
+            </w:r>
+          </w:p>
+        </w:tc>
+      </w:tr>
+      <w:tr>
+        <w:trPr>
+          <w:tblHeader w:val="false"/>
+        </w:trPr>
+        <w:tc>
+          <w:tcPr>
+            <w:tcW w:type="dxa" w:w="2500"/>
+            <w:tcBorders>
+              <w:top w:val="single" w:color="D1D5DB" w:sz="1"/>
+              <w:left w:val="single" w:color="D1D5DB" w:sz="1"/>
+              <w:bottom w:val="single" w:color="D1D5DB" w:sz="1"/>
+              <w:right w:val="single" w:color="D1D5DB" w:sz="1"/>
+            </w:tcBorders>
+            <w:tcMar>
+              <w:top w:type="dxa" w:w="60"/>
+              <w:left w:type="dxa" w:w="110"/>
+              <w:bottom w:type="dxa" w:w="60"/>
+              <w:right w:type="dxa" w:w="110"/>
+            </w:tcMar>
+          </w:tcPr>
+          <w:p>
+            <w:pPr>
+              <w:spacing w:after="0" w:line="264"/>
+            </w:pPr>
+            <w:r>
+              <w:rPr>
+                <w:rFonts w:ascii="Arial" w:cs="Arial" w:eastAsia="Arial" w:hAnsi="Arial"/>
+                <w:sz w:val="19"/>
+                <w:szCs w:val="19"/>
+              </w:rPr>
+              <w:t xml:space="preserve">Migración de algoritmo (Delegating)</w:t>
+            </w:r>
+          </w:p>
+        </w:tc>
+        <w:tc>
+          <w:tcPr>
+            <w:tcW w:type="dxa" w:w="3700"/>
+            <w:tcBorders>
+              <w:top w:val="single" w:color="D1D5DB" w:sz="1"/>
+              <w:left w:val="single" w:color="D1D5DB" w:sz="1"/>
+              <w:bottom w:val="single" w:color="D1D5DB" w:sz="1"/>
+              <w:right w:val="single" w:color="D1D5DB" w:sz="1"/>
+            </w:tcBorders>
+            <w:tcMar>
+              <w:top w:type="dxa" w:w="60"/>
+              <w:left w:type="dxa" w:w="110"/>
+              <w:bottom w:type="dxa" w:w="60"/>
+              <w:right w:type="dxa" w:w="110"/>
+            </w:tcMar>
+          </w:tcPr>
+          <w:p>
+            <w:pPr>
+              <w:spacing w:after="0" w:line="264"/>
+            </w:pPr>
+            <w:r>
+              <w:rPr>
+                <w:rFonts w:ascii="Arial" w:cs="Arial" w:eastAsia="Arial" w:hAnsi="Arial"/>
+                <w:sz w:val="19"/>
+                <w:szCs w:val="19"/>
+              </w:rPr>
+              <w:t xml:space="preserve">DelegatingPasswordEncoder Argon2id+BCrypt</w:t>
+            </w:r>
+          </w:p>
+        </w:tc>
+        <w:tc>
+          <w:tcPr>
+            <w:tcW w:type="dxa" w:w="3160"/>
+            <w:tcBorders>
+              <w:top w:val="single" w:color="D1D5DB" w:sz="1"/>
+              <w:left w:val="single" w:color="D1D5DB" w:sz="1"/>
+              <w:bottom w:val="single" w:color="D1D5DB" w:sz="1"/>
+              <w:right w:val="single" w:color="D1D5DB" w:sz="1"/>
+            </w:tcBorders>
+            <w:tcMar>
+              <w:top w:type="dxa" w:w="60"/>
+              <w:left w:type="dxa" w:w="110"/>
+              <w:bottom w:type="dxa" w:w="60"/>
+              <w:right w:type="dxa" w:w="110"/>
+            </w:tcMar>
+          </w:tcPr>
+          <w:p>
+            <w:pPr>
+              <w:spacing w:after="0" w:line="264"/>
+            </w:pPr>
+            <w:r>
+              <w:rPr>
+                <w:rFonts w:ascii="Arial" w:cs="Arial" w:eastAsia="Arial" w:hAnsi="Arial"/>
+                <w:sz w:val="19"/>
+                <w:szCs w:val="19"/>
+              </w:rPr>
+              <w:t xml:space="preserve">Cambiar de hash sin invalidar contraseñas existentes</w:t>
             </w:r>
           </w:p>
         </w:tc>

</xml_diff>

<commit_message>
feat(gateway): refuerza cabeceras de seguridad (COOP/CORP) + test de regresión
</commit_message>
<xml_diff>
--- a/BookPlus-Stack-Tecnologico.docx
+++ b/BookPlus-Stack-Tecnologico.docx
@@ -10053,6 +10053,198 @@
     </w:p>
     <w:p>
       <w:pPr>
+        <w:pStyle w:val="Heading2"/>
+      </w:pPr>
+      <w:r>
+        <w:rPr>
+          <w:rFonts w:ascii="Arial" w:cs="Arial" w:eastAsia="Arial" w:hAnsi="Arial"/>
+        </w:rPr>
+        <w:t xml:space="preserve">13.28 Cabeceras de seguridad HTTP (API Gateway)</w:t>
+      </w:r>
+    </w:p>
+    <w:p>
+      <w:pPr>
+        <w:spacing w:after="120" w:line="276"/>
+      </w:pPr>
+      <w:r>
+        <w:rPr>
+          <w:rFonts w:ascii="Arial" w:cs="Arial" w:eastAsia="Arial" w:hAnsi="Arial"/>
+          <w:b/>
+          <w:bCs/>
+        </w:rPr>
+        <w:t xml:space="preserve">Qué es: </w:t>
+      </w:r>
+      <w:r>
+        <w:rPr>
+          <w:rFonts w:ascii="Arial" w:cs="Arial" w:eastAsia="Arial" w:hAnsi="Arial"/>
+        </w:rPr>
+        <w:t xml:space="preserve">el navegador toma muchas decisiones de seguridad según las cabeceras que devuelve el servidor (si puede meterse en un iframe, qué orígenes cargan scripts, si fuerza HTTPS…). Se centralizan en el API Gateway, de modo que todas las respuestas de todos los microservicios salen endurecidas desde un único sitio, de forma consistente.</w:t>
+      </w:r>
+    </w:p>
+    <w:p>
+      <w:pPr>
+        <w:spacing w:after="120" w:line="276"/>
+      </w:pPr>
+      <w:r>
+        <w:rPr>
+          <w:rFonts w:ascii="Arial" w:cs="Arial" w:eastAsia="Arial" w:hAnsi="Arial"/>
+          <w:b/>
+          <w:bCs/>
+        </w:rPr>
+        <w:t xml:space="preserve">Cómo se integra: </w:t>
+      </w:r>
+      <w:r>
+        <w:rPr>
+          <w:rFonts w:ascii="Arial" w:cs="Arial" w:eastAsia="Arial" w:hAnsi="Arial"/>
+        </w:rPr>
+        <w:t xml:space="preserve">un </w:t>
+      </w:r>
+      <w:r>
+        <w:rPr>
+          <w:rFonts w:ascii="Consolas" w:cs="Consolas" w:eastAsia="Consolas" w:hAnsi="Consolas"/>
+          <w:color w:val="4F46E5"/>
+        </w:rPr>
+        <w:t xml:space="preserve">SecurityHeadersFilter</w:t>
+      </w:r>
+      <w:r>
+        <w:rPr>
+          <w:rFonts w:ascii="Arial" w:cs="Arial" w:eastAsia="Arial" w:hAnsi="Arial"/>
+        </w:rPr>
+        <w:t xml:space="preserve"> (</w:t>
+      </w:r>
+      <w:r>
+        <w:rPr>
+          <w:rFonts w:ascii="Consolas" w:cs="Consolas" w:eastAsia="Consolas" w:hAnsi="Consolas"/>
+          <w:color w:val="4F46E5"/>
+        </w:rPr>
+        <w:t xml:space="preserve">GlobalFilter</w:t>
+      </w:r>
+      <w:r>
+        <w:rPr>
+          <w:rFonts w:ascii="Arial" w:cs="Arial" w:eastAsia="Arial" w:hAnsi="Arial"/>
+        </w:rPr>
+        <w:t xml:space="preserve"> de Spring Cloud Gateway) añade en cada respuesta el conjunto recomendado por OWASP: </w:t>
+      </w:r>
+      <w:r>
+        <w:rPr>
+          <w:rFonts w:ascii="Consolas" w:cs="Consolas" w:eastAsia="Consolas" w:hAnsi="Consolas"/>
+          <w:color w:val="4F46E5"/>
+        </w:rPr>
+        <w:t xml:space="preserve">Content-Security-Policy</w:t>
+      </w:r>
+      <w:r>
+        <w:rPr>
+          <w:rFonts w:ascii="Arial" w:cs="Arial" w:eastAsia="Arial" w:hAnsi="Arial"/>
+        </w:rPr>
+        <w:t xml:space="preserve">, </w:t>
+      </w:r>
+      <w:r>
+        <w:rPr>
+          <w:rFonts w:ascii="Consolas" w:cs="Consolas" w:eastAsia="Consolas" w:hAnsi="Consolas"/>
+          <w:color w:val="4F46E5"/>
+        </w:rPr>
+        <w:t xml:space="preserve">Strict-Transport-Security</w:t>
+      </w:r>
+      <w:r>
+        <w:rPr>
+          <w:rFonts w:ascii="Arial" w:cs="Arial" w:eastAsia="Arial" w:hAnsi="Arial"/>
+        </w:rPr>
+        <w:t xml:space="preserve"> (HSTS), </w:t>
+      </w:r>
+      <w:r>
+        <w:rPr>
+          <w:rFonts w:ascii="Consolas" w:cs="Consolas" w:eastAsia="Consolas" w:hAnsi="Consolas"/>
+          <w:color w:val="4F46E5"/>
+        </w:rPr>
+        <w:t xml:space="preserve">X-Content-Type-Options</w:t>
+      </w:r>
+      <w:r>
+        <w:rPr>
+          <w:rFonts w:ascii="Arial" w:cs="Arial" w:eastAsia="Arial" w:hAnsi="Arial"/>
+        </w:rPr>
+        <w:t xml:space="preserve">, </w:t>
+      </w:r>
+      <w:r>
+        <w:rPr>
+          <w:rFonts w:ascii="Consolas" w:cs="Consolas" w:eastAsia="Consolas" w:hAnsi="Consolas"/>
+          <w:color w:val="4F46E5"/>
+        </w:rPr>
+        <w:t xml:space="preserve">X-Frame-Options</w:t>
+      </w:r>
+      <w:r>
+        <w:rPr>
+          <w:rFonts w:ascii="Arial" w:cs="Arial" w:eastAsia="Arial" w:hAnsi="Arial"/>
+        </w:rPr>
+        <w:t xml:space="preserve">, </w:t>
+      </w:r>
+      <w:r>
+        <w:rPr>
+          <w:rFonts w:ascii="Consolas" w:cs="Consolas" w:eastAsia="Consolas" w:hAnsi="Consolas"/>
+          <w:color w:val="4F46E5"/>
+        </w:rPr>
+        <w:t xml:space="preserve">Referrer-Policy</w:t>
+      </w:r>
+      <w:r>
+        <w:rPr>
+          <w:rFonts w:ascii="Arial" w:cs="Arial" w:eastAsia="Arial" w:hAnsi="Arial"/>
+        </w:rPr>
+        <w:t xml:space="preserve">, </w:t>
+      </w:r>
+      <w:r>
+        <w:rPr>
+          <w:rFonts w:ascii="Consolas" w:cs="Consolas" w:eastAsia="Consolas" w:hAnsi="Consolas"/>
+          <w:color w:val="4F46E5"/>
+        </w:rPr>
+        <w:t xml:space="preserve">Permissions-Policy</w:t>
+      </w:r>
+      <w:r>
+        <w:rPr>
+          <w:rFonts w:ascii="Arial" w:cs="Arial" w:eastAsia="Arial" w:hAnsi="Arial"/>
+        </w:rPr>
+        <w:t xml:space="preserve">, y las cabeceras de aislamiento modernas </w:t>
+      </w:r>
+      <w:r>
+        <w:rPr>
+          <w:rFonts w:ascii="Consolas" w:cs="Consolas" w:eastAsia="Consolas" w:hAnsi="Consolas"/>
+          <w:color w:val="4F46E5"/>
+        </w:rPr>
+        <w:t xml:space="preserve">Cross-Origin-Opener-Policy</w:t>
+      </w:r>
+      <w:r>
+        <w:rPr>
+          <w:rFonts w:ascii="Arial" w:cs="Arial" w:eastAsia="Arial" w:hAnsi="Arial"/>
+        </w:rPr>
+        <w:t xml:space="preserve">/</w:t>
+      </w:r>
+      <w:r>
+        <w:rPr>
+          <w:rFonts w:ascii="Consolas" w:cs="Consolas" w:eastAsia="Consolas" w:hAnsi="Consolas"/>
+          <w:color w:val="4F46E5"/>
+        </w:rPr>
+        <w:t xml:space="preserve">Cross-Origin-Resource-Policy</w:t>
+      </w:r>
+      <w:r>
+        <w:rPr>
+          <w:rFonts w:ascii="Arial" w:cs="Arial" w:eastAsia="Arial" w:hAnsi="Arial"/>
+        </w:rPr>
+        <w:t xml:space="preserve"> y </w:t>
+      </w:r>
+      <w:r>
+        <w:rPr>
+          <w:rFonts w:ascii="Consolas" w:cs="Consolas" w:eastAsia="Consolas" w:hAnsi="Consolas"/>
+          <w:color w:val="4F46E5"/>
+        </w:rPr>
+        <w:t xml:space="preserve">X-Permitted-Cross-Domain-Policies</w:t>
+      </w:r>
+      <w:r>
+        <w:rPr>
+          <w:rFonts w:ascii="Arial" w:cs="Arial" w:eastAsia="Arial" w:hAnsi="Arial"/>
+        </w:rPr>
+        <w:t xml:space="preserve">. Verificado con un unit test que actúa de guardia de regresión. Detalle en SECURITY-HEADERS.md.</w:t>
+      </w:r>
+    </w:p>
+    <w:p>
+      <w:pPr>
         <w:pStyle w:val="Heading1"/>
       </w:pPr>
       <w:r>
@@ -13420,6 +13612,101 @@
                 <w:szCs w:val="19"/>
               </w:rPr>
               <w:t xml:space="preserve">Cambiar de hash sin invalidar contraseñas existentes</w:t>
+            </w:r>
+          </w:p>
+        </w:tc>
+      </w:tr>
+      <w:tr>
+        <w:trPr>
+          <w:tblHeader w:val="false"/>
+        </w:trPr>
+        <w:tc>
+          <w:tcPr>
+            <w:tcW w:type="dxa" w:w="2500"/>
+            <w:tcBorders>
+              <w:top w:val="single" w:color="D1D5DB" w:sz="1"/>
+              <w:left w:val="single" w:color="D1D5DB" w:sz="1"/>
+              <w:bottom w:val="single" w:color="D1D5DB" w:sz="1"/>
+              <w:right w:val="single" w:color="D1D5DB" w:sz="1"/>
+            </w:tcBorders>
+            <w:tcMar>
+              <w:top w:type="dxa" w:w="60"/>
+              <w:left w:type="dxa" w:w="110"/>
+              <w:bottom w:type="dxa" w:w="60"/>
+              <w:right w:type="dxa" w:w="110"/>
+            </w:tcMar>
+          </w:tcPr>
+          <w:p>
+            <w:pPr>
+              <w:spacing w:after="0" w:line="264"/>
+            </w:pPr>
+            <w:r>
+              <w:rPr>
+                <w:rFonts w:ascii="Arial" w:cs="Arial" w:eastAsia="Arial" w:hAnsi="Arial"/>
+                <w:sz w:val="19"/>
+                <w:szCs w:val="19"/>
+              </w:rPr>
+              <w:t xml:space="preserve">Cabeceras de seguridad (Gateway)</w:t>
+            </w:r>
+          </w:p>
+        </w:tc>
+        <w:tc>
+          <w:tcPr>
+            <w:tcW w:type="dxa" w:w="3700"/>
+            <w:tcBorders>
+              <w:top w:val="single" w:color="D1D5DB" w:sz="1"/>
+              <w:left w:val="single" w:color="D1D5DB" w:sz="1"/>
+              <w:bottom w:val="single" w:color="D1D5DB" w:sz="1"/>
+              <w:right w:val="single" w:color="D1D5DB" w:sz="1"/>
+            </w:tcBorders>
+            <w:tcMar>
+              <w:top w:type="dxa" w:w="60"/>
+              <w:left w:type="dxa" w:w="110"/>
+              <w:bottom w:type="dxa" w:w="60"/>
+              <w:right w:type="dxa" w:w="110"/>
+            </w:tcMar>
+          </w:tcPr>
+          <w:p>
+            <w:pPr>
+              <w:spacing w:after="0" w:line="264"/>
+            </w:pPr>
+            <w:r>
+              <w:rPr>
+                <w:rFonts w:ascii="Arial" w:cs="Arial" w:eastAsia="Arial" w:hAnsi="Arial"/>
+                <w:sz w:val="19"/>
+                <w:szCs w:val="19"/>
+              </w:rPr>
+              <w:t xml:space="preserve">SecurityHeadersFilter (CSP, HSTS, COOP...)</w:t>
+            </w:r>
+          </w:p>
+        </w:tc>
+        <w:tc>
+          <w:tcPr>
+            <w:tcW w:type="dxa" w:w="3160"/>
+            <w:tcBorders>
+              <w:top w:val="single" w:color="D1D5DB" w:sz="1"/>
+              <w:left w:val="single" w:color="D1D5DB" w:sz="1"/>
+              <w:bottom w:val="single" w:color="D1D5DB" w:sz="1"/>
+              <w:right w:val="single" w:color="D1D5DB" w:sz="1"/>
+            </w:tcBorders>
+            <w:tcMar>
+              <w:top w:type="dxa" w:w="60"/>
+              <w:left w:type="dxa" w:w="110"/>
+              <w:bottom w:type="dxa" w:w="60"/>
+              <w:right w:type="dxa" w:w="110"/>
+            </w:tcMar>
+          </w:tcPr>
+          <w:p>
+            <w:pPr>
+              <w:spacing w:after="0" w:line="264"/>
+            </w:pPr>
+            <w:r>
+              <w:rPr>
+                <w:rFonts w:ascii="Arial" w:cs="Arial" w:eastAsia="Arial" w:hAnsi="Arial"/>
+                <w:sz w:val="19"/>
+                <w:szCs w:val="19"/>
+              </w:rPr>
+              <w:t xml:space="preserve">Endurecer todas las respuestas desde un único punto</w:t>
             </w:r>
           </w:p>
         </w:tc>

</xml_diff>

<commit_message>
ci(jenkins): Shared Library + JCasC + multibranch + blue-green + Vault/Slack opcional
- JCasC arranca reproducible (admin, GHCR, Sonar, Shared Library, job multibranch)
- Vault/Slack quedan como bloque opcional (evita fallo de arranque por credencial no resuelta)
- casc por bind-mount (no lo tapa el volumen jenkins_home); wizard desactivado
</commit_message>
<xml_diff>
--- a/BookPlus-Stack-Tecnologico.docx
+++ b/BookPlus-Stack-Tecnologico.docx
@@ -10769,7 +10769,7 @@
         <w:rPr>
           <w:rFonts w:ascii="Arial" w:cs="Arial" w:eastAsia="Arial" w:hAnsi="Arial"/>
         </w:rPr>
-        <w:t xml:space="preserve">13.34 Jenkins (pipeline CI/CD alternativo)</w:t>
+        <w:t xml:space="preserve">13.34 Jenkins (pipeline CI/CD avanzado)</w:t>
       </w:r>
     </w:p>
     <w:p>
@@ -10788,7 +10788,7 @@
         <w:rPr>
           <w:rFonts w:ascii="Arial" w:cs="Arial" w:eastAsia="Arial" w:hAnsi="Arial"/>
         </w:rPr>
-        <w:t xml:space="preserve">el CI/CD principal es GitHub Actions, pero en banca y gran empresa Jenkins sigue siendo el estándar. Se añade un Jenkinsfile que expresa el mismo pipeline en Jenkins — no reemplaza a GitHub Actions, demuestra que el flujo es portable y está como pipeline-as-code en la herramienta más extendida del sector.</w:t>
+        <w:t xml:space="preserve">el CI/CD principal del proyecto es GitHub Actions, pero en banca y gran empresa Jenkins sigue siendo el estándar (a menudo on-premise, por políticas internas). Se añade un Jenkinsfile que expresa EL MISMO pipeline en Jenkins: no reemplaza a GitHub Actions, demuestra que el flujo es portable (pipeline-as-code) y que se domina la herramienta más extendida del sector. Ambos son intercambiables y hacen lo mismo; en un proyecto real se elegiría uno, aquí coexisten como demostración.</w:t>
       </w:r>
     </w:p>
     <w:p>
@@ -10801,13 +10801,7 @@
           <w:b/>
           <w:bCs/>
         </w:rPr>
-        <w:t xml:space="preserve">Cómo se integra: </w:t>
-      </w:r>
-      <w:r>
-        <w:rPr>
-          <w:rFonts w:ascii="Arial" w:cs="Arial" w:eastAsia="Arial" w:hAnsi="Arial"/>
-        </w:rPr>
-        <w:t xml:space="preserve">un </w:t>
+        <w:t xml:space="preserve">Cómo funciona — etapas del </w:t>
       </w:r>
       <w:r>
         <w:rPr>
@@ -10820,7 +10814,357 @@
         <w:rPr>
           <w:rFonts w:ascii="Arial" w:cs="Arial" w:eastAsia="Arial" w:hAnsi="Arial"/>
         </w:rPr>
-        <w:t xml:space="preserve"> declarativo con etapas Checkout → Build &amp; Test (mvn en contenedor) → SonarCloud → Package → Docker build &amp; push (GHCR) → Trivy → Deploy (manual con aprobación). Se acompaña de </w:t>
+        <w:t xml:space="preserve">:</w:t>
+      </w:r>
+    </w:p>
+    <w:p>
+      <w:pPr>
+        <w:pStyle w:val="ListParagraph"/>
+        <w:numPr>
+          <w:ilvl w:val="0"/>
+          <w:numId w:val="2"/>
+        </w:numPr>
+        <w:spacing w:after="80" w:line="268"/>
+      </w:pPr>
+      <w:r>
+        <w:rPr>
+          <w:rFonts w:ascii="Arial" w:cs="Arial" w:eastAsia="Arial" w:hAnsi="Arial"/>
+          <w:b/>
+          <w:bCs/>
+        </w:rPr>
+        <w:t xml:space="preserve">Checkout: </w:t>
+      </w:r>
+      <w:r>
+        <w:rPr>
+          <w:rFonts w:ascii="Arial" w:cs="Arial" w:eastAsia="Arial" w:hAnsi="Arial"/>
+        </w:rPr>
+        <w:t xml:space="preserve">descarga el código, calcula el hash corto del commit y hace </w:t>
+      </w:r>
+      <w:r>
+        <w:rPr>
+          <w:rFonts w:ascii="Consolas" w:cs="Consolas" w:eastAsia="Consolas" w:hAnsi="Consolas"/>
+          <w:color w:val="4F46E5"/>
+        </w:rPr>
+        <w:t xml:space="preserve">stash</w:t>
+      </w:r>
+      <w:r>
+        <w:rPr>
+          <w:rFonts w:ascii="Arial" w:cs="Arial" w:eastAsia="Arial" w:hAnsi="Arial"/>
+        </w:rPr>
+        <w:t xml:space="preserve"> para reutilizarlo entre agentes sin re-clonar.</w:t>
+      </w:r>
+    </w:p>
+    <w:p>
+      <w:pPr>
+        <w:pStyle w:val="ListParagraph"/>
+        <w:numPr>
+          <w:ilvl w:val="0"/>
+          <w:numId w:val="2"/>
+        </w:numPr>
+        <w:spacing w:after="80" w:line="268"/>
+      </w:pPr>
+      <w:r>
+        <w:rPr>
+          <w:rFonts w:ascii="Arial" w:cs="Arial" w:eastAsia="Arial" w:hAnsi="Arial"/>
+          <w:b/>
+          <w:bCs/>
+        </w:rPr>
+        <w:t xml:space="preserve">Build &amp; Test: </w:t>
+      </w:r>
+      <w:r>
+        <w:rPr>
+          <w:rFonts w:ascii="Arial" w:cs="Arial" w:eastAsia="Arial" w:hAnsi="Arial"/>
+        </w:rPr>
+        <w:t xml:space="preserve">en un contenedor Maven, ejecuta el </w:t>
+      </w:r>
+      <w:r>
+        <w:rPr>
+          <w:rFonts w:ascii="Consolas" w:cs="Consolas" w:eastAsia="Consolas" w:hAnsi="Consolas"/>
+          <w:color w:val="4F46E5"/>
+        </w:rPr>
+        <w:t xml:space="preserve">mvn test</w:t>
+      </w:r>
+      <w:r>
+        <w:rPr>
+          <w:rFonts w:ascii="Arial" w:cs="Arial" w:eastAsia="Arial" w:hAnsi="Arial"/>
+        </w:rPr>
+        <w:t xml:space="preserve"> de los 9 microservicios EN PARALELO (un branch por servicio) y publica los resultados JUnit.</w:t>
+      </w:r>
+    </w:p>
+    <w:p>
+      <w:pPr>
+        <w:pStyle w:val="ListParagraph"/>
+        <w:numPr>
+          <w:ilvl w:val="0"/>
+          <w:numId w:val="2"/>
+        </w:numPr>
+        <w:spacing w:after="80" w:line="268"/>
+      </w:pPr>
+      <w:r>
+        <w:rPr>
+          <w:rFonts w:ascii="Arial" w:cs="Arial" w:eastAsia="Arial" w:hAnsi="Arial"/>
+          <w:b/>
+          <w:bCs/>
+        </w:rPr>
+        <w:t xml:space="preserve">SonarCloud + Quality Gate: </w:t>
+      </w:r>
+      <w:r>
+        <w:rPr>
+          <w:rFonts w:ascii="Arial" w:cs="Arial" w:eastAsia="Arial" w:hAnsi="Arial"/>
+        </w:rPr>
+        <w:t xml:space="preserve">análisis con </w:t>
+      </w:r>
+      <w:r>
+        <w:rPr>
+          <w:rFonts w:ascii="Consolas" w:cs="Consolas" w:eastAsia="Consolas" w:hAnsi="Consolas"/>
+          <w:color w:val="4F46E5"/>
+        </w:rPr>
+        <w:t xml:space="preserve">withSonarQubeEnv</w:t>
+      </w:r>
+      <w:r>
+        <w:rPr>
+          <w:rFonts w:ascii="Arial" w:cs="Arial" w:eastAsia="Arial" w:hAnsi="Arial"/>
+        </w:rPr>
+        <w:t xml:space="preserve"> y </w:t>
+      </w:r>
+      <w:r>
+        <w:rPr>
+          <w:rFonts w:ascii="Consolas" w:cs="Consolas" w:eastAsia="Consolas" w:hAnsi="Consolas"/>
+          <w:color w:val="4F46E5"/>
+        </w:rPr>
+        <w:t xml:space="preserve">waitForQualityGate abortPipeline:true</w:t>
+      </w:r>
+      <w:r>
+        <w:rPr>
+          <w:rFonts w:ascii="Arial" w:cs="Arial" w:eastAsia="Arial" w:hAnsi="Arial"/>
+        </w:rPr>
+        <w:t xml:space="preserve"> — si el Quality Gate (cobertura, bugs, vulnerabilidades) no se cumple, el pipeline se ABORTA.</w:t>
+      </w:r>
+    </w:p>
+    <w:p>
+      <w:pPr>
+        <w:pStyle w:val="ListParagraph"/>
+        <w:numPr>
+          <w:ilvl w:val="0"/>
+          <w:numId w:val="2"/>
+        </w:numPr>
+        <w:spacing w:after="80" w:line="268"/>
+      </w:pPr>
+      <w:r>
+        <w:rPr>
+          <w:rFonts w:ascii="Arial" w:cs="Arial" w:eastAsia="Arial" w:hAnsi="Arial"/>
+          <w:b/>
+          <w:bCs/>
+        </w:rPr>
+        <w:t xml:space="preserve">Package: </w:t>
+      </w:r>
+      <w:r>
+        <w:rPr>
+          <w:rFonts w:ascii="Arial" w:cs="Arial" w:eastAsia="Arial" w:hAnsi="Arial"/>
+        </w:rPr>
+        <w:t xml:space="preserve">empaqueta los JAR y los archiva con </w:t>
+      </w:r>
+      <w:r>
+        <w:rPr>
+          <w:rFonts w:ascii="Consolas" w:cs="Consolas" w:eastAsia="Consolas" w:hAnsi="Consolas"/>
+          <w:color w:val="4F46E5"/>
+        </w:rPr>
+        <w:t xml:space="preserve">stash</w:t>
+      </w:r>
+      <w:r>
+        <w:rPr>
+          <w:rFonts w:ascii="Arial" w:cs="Arial" w:eastAsia="Arial" w:hAnsi="Arial"/>
+        </w:rPr>
+        <w:t xml:space="preserve">.</w:t>
+      </w:r>
+    </w:p>
+    <w:p>
+      <w:pPr>
+        <w:pStyle w:val="ListParagraph"/>
+        <w:numPr>
+          <w:ilvl w:val="0"/>
+          <w:numId w:val="2"/>
+        </w:numPr>
+        <w:spacing w:after="80" w:line="268"/>
+      </w:pPr>
+      <w:r>
+        <w:rPr>
+          <w:rFonts w:ascii="Arial" w:cs="Arial" w:eastAsia="Arial" w:hAnsi="Arial"/>
+          <w:b/>
+          <w:bCs/>
+        </w:rPr>
+        <w:t xml:space="preserve">Build &amp; Push images: </w:t>
+      </w:r>
+      <w:r>
+        <w:rPr>
+          <w:rFonts w:ascii="Arial" w:cs="Arial" w:eastAsia="Arial" w:hAnsi="Arial"/>
+        </w:rPr>
+        <w:t xml:space="preserve">construye y publica las imágenes en GHCR EN PARALELO, etiquetadas con el hash del commit.</w:t>
+      </w:r>
+    </w:p>
+    <w:p>
+      <w:pPr>
+        <w:pStyle w:val="ListParagraph"/>
+        <w:numPr>
+          <w:ilvl w:val="0"/>
+          <w:numId w:val="2"/>
+        </w:numPr>
+        <w:spacing w:after="80" w:line="268"/>
+      </w:pPr>
+      <w:r>
+        <w:rPr>
+          <w:rFonts w:ascii="Arial" w:cs="Arial" w:eastAsia="Arial" w:hAnsi="Arial"/>
+          <w:b/>
+          <w:bCs/>
+        </w:rPr>
+        <w:t xml:space="preserve">Security scan (Trivy): </w:t>
+      </w:r>
+      <w:r>
+        <w:rPr>
+          <w:rFonts w:ascii="Arial" w:cs="Arial" w:eastAsia="Arial" w:hAnsi="Arial"/>
+        </w:rPr>
+        <w:t xml:space="preserve">escaneo de vulnerabilidades de cada imagen, también en paralelo.</w:t>
+      </w:r>
+    </w:p>
+    <w:p>
+      <w:pPr>
+        <w:pStyle w:val="ListParagraph"/>
+        <w:numPr>
+          <w:ilvl w:val="0"/>
+          <w:numId w:val="2"/>
+        </w:numPr>
+        <w:spacing w:after="80" w:line="268"/>
+      </w:pPr>
+      <w:r>
+        <w:rPr>
+          <w:rFonts w:ascii="Arial" w:cs="Arial" w:eastAsia="Arial" w:hAnsi="Arial"/>
+          <w:b/>
+          <w:bCs/>
+        </w:rPr>
+        <w:t xml:space="preserve">Deploy: </w:t>
+      </w:r>
+      <w:r>
+        <w:rPr>
+          <w:rFonts w:ascii="Arial" w:cs="Arial" w:eastAsia="Arial" w:hAnsi="Arial"/>
+        </w:rPr>
+        <w:t xml:space="preserve">aprobación manual (</w:t>
+      </w:r>
+      <w:r>
+        <w:rPr>
+          <w:rFonts w:ascii="Consolas" w:cs="Consolas" w:eastAsia="Consolas" w:hAnsi="Consolas"/>
+          <w:color w:val="4F46E5"/>
+        </w:rPr>
+        <w:t xml:space="preserve">input</w:t>
+      </w:r>
+      <w:r>
+        <w:rPr>
+          <w:rFonts w:ascii="Arial" w:cs="Arial" w:eastAsia="Arial" w:hAnsi="Arial"/>
+        </w:rPr>
+        <w:t xml:space="preserve">) con timeout antes de desplegar al entorno elegido.</w:t>
+      </w:r>
+    </w:p>
+    <w:p>
+      <w:pPr>
+        <w:spacing w:after="120" w:line="276"/>
+      </w:pPr>
+      <w:r>
+        <w:rPr>
+          <w:rFonts w:ascii="Arial" w:cs="Arial" w:eastAsia="Arial" w:hAnsi="Arial"/>
+          <w:b/>
+          <w:bCs/>
+        </w:rPr>
+        <w:t xml:space="preserve">Características avanzadas: </w:t>
+      </w:r>
+      <w:r>
+        <w:rPr>
+          <w:rFonts w:ascii="Consolas" w:cs="Consolas" w:eastAsia="Consolas" w:hAnsi="Consolas"/>
+          <w:color w:val="4F46E5"/>
+        </w:rPr>
+        <w:t xml:space="preserve">agent none</w:t>
+      </w:r>
+      <w:r>
+        <w:rPr>
+          <w:rFonts w:ascii="Arial" w:cs="Arial" w:eastAsia="Arial" w:hAnsi="Arial"/>
+        </w:rPr>
+        <w:t xml:space="preserve"> con un agente por etapa (cada una usa el contenedor que necesita); paralelismo en tests e imágenes; parámetros del build (</w:t>
+      </w:r>
+      <w:r>
+        <w:rPr>
+          <w:rFonts w:ascii="Consolas" w:cs="Consolas" w:eastAsia="Consolas" w:hAnsi="Consolas"/>
+          <w:color w:val="4F46E5"/>
+        </w:rPr>
+        <w:t xml:space="preserve">RUN_SONAR</w:t>
+      </w:r>
+      <w:r>
+        <w:rPr>
+          <w:rFonts w:ascii="Arial" w:cs="Arial" w:eastAsia="Arial" w:hAnsi="Arial"/>
+        </w:rPr>
+        <w:t xml:space="preserve">, </w:t>
+      </w:r>
+      <w:r>
+        <w:rPr>
+          <w:rFonts w:ascii="Consolas" w:cs="Consolas" w:eastAsia="Consolas" w:hAnsi="Consolas"/>
+          <w:color w:val="4F46E5"/>
+        </w:rPr>
+        <w:t xml:space="preserve">PUSH_IMAGES</w:t>
+      </w:r>
+      <w:r>
+        <w:rPr>
+          <w:rFonts w:ascii="Arial" w:cs="Arial" w:eastAsia="Arial" w:hAnsi="Arial"/>
+        </w:rPr>
+        <w:t xml:space="preserve">, </w:t>
+      </w:r>
+      <w:r>
+        <w:rPr>
+          <w:rFonts w:ascii="Consolas" w:cs="Consolas" w:eastAsia="Consolas" w:hAnsi="Consolas"/>
+          <w:color w:val="4F46E5"/>
+        </w:rPr>
+        <w:t xml:space="preserve">DEPLOY_ENV</w:t>
+      </w:r>
+      <w:r>
+        <w:rPr>
+          <w:rFonts w:ascii="Arial" w:cs="Arial" w:eastAsia="Arial" w:hAnsi="Arial"/>
+        </w:rPr>
+        <w:t xml:space="preserve">) para reutilizar el mismo pipeline en un PR o en una release sin tocar el código; Quality Gate que aborta; </w:t>
+      </w:r>
+      <w:r>
+        <w:rPr>
+          <w:rFonts w:ascii="Consolas" w:cs="Consolas" w:eastAsia="Consolas" w:hAnsi="Consolas"/>
+          <w:color w:val="4F46E5"/>
+        </w:rPr>
+        <w:t xml:space="preserve">stash/unstash</w:t>
+      </w:r>
+      <w:r>
+        <w:rPr>
+          <w:rFonts w:ascii="Arial" w:cs="Arial" w:eastAsia="Arial" w:hAnsi="Arial"/>
+        </w:rPr>
+        <w:t xml:space="preserve"> entre agentes; caché de Maven; y aprobación con timeout para el deploy.</w:t>
+      </w:r>
+    </w:p>
+    <w:p>
+      <w:pPr>
+        <w:spacing w:after="120" w:line="276"/>
+      </w:pPr>
+      <w:r>
+        <w:rPr>
+          <w:rFonts w:ascii="Arial" w:cs="Arial" w:eastAsia="Arial" w:hAnsi="Arial"/>
+          <w:b/>
+          <w:bCs/>
+        </w:rPr>
+        <w:t xml:space="preserve">Ficheros: </w:t>
+      </w:r>
+      <w:r>
+        <w:rPr>
+          <w:rFonts w:ascii="Consolas" w:cs="Consolas" w:eastAsia="Consolas" w:hAnsi="Consolas"/>
+          <w:color w:val="4F46E5"/>
+        </w:rPr>
+        <w:t xml:space="preserve">Jenkinsfile</w:t>
+      </w:r>
+      <w:r>
+        <w:rPr>
+          <w:rFonts w:ascii="Arial" w:cs="Arial" w:eastAsia="Arial" w:hAnsi="Arial"/>
+        </w:rPr>
+        <w:t xml:space="preserve"> (pipeline), </w:t>
       </w:r>
       <w:r>
         <w:rPr>
@@ -10833,7 +11177,7 @@
         <w:rPr>
           <w:rFonts w:ascii="Arial" w:cs="Arial" w:eastAsia="Arial" w:hAnsi="Arial"/>
         </w:rPr>
-        <w:t xml:space="preserve"> (Jenkins LTS + CLI de Docker + plugins) y </w:t>
+        <w:t xml:space="preserve"> (Jenkins LTS + CLI de Docker + plugins: Pipeline, Docker Pipeline, JUnit, AnsiColor, Workspace Cleanup, SonarQube Scanner) y </w:t>
       </w:r>
       <w:r>
         <w:rPr>
@@ -10846,7 +11190,331 @@
         <w:rPr>
           <w:rFonts w:ascii="Arial" w:cs="Arial" w:eastAsia="Arial" w:hAnsi="Arial"/>
         </w:rPr>
-        <w:t xml:space="preserve"> para levantarlo en local. Es configuración (se verifica ejecutando el pipeline, no con tests). Detalle en JENKINS.md.</w:t>
+        <w:t xml:space="preserve"> para levantarlo en local con el socket de Docker montado. Es configuración (se verifica ejecutando el pipeline, no con tests). Comparativa GitHub Actions vs Jenkins y guía paso a paso en JENKINS.md.</w:t>
+      </w:r>
+    </w:p>
+    <w:p>
+      <w:pPr>
+        <w:pStyle w:val="Heading2"/>
+      </w:pPr>
+      <w:r>
+        <w:rPr>
+          <w:rFonts w:ascii="Arial" w:cs="Arial" w:eastAsia="Arial" w:hAnsi="Arial"/>
+        </w:rPr>
+        <w:t xml:space="preserve">13.35 Jenkins a nivel experto (Shared Library, JCasC, blue-green, Vault)</w:t>
+      </w:r>
+    </w:p>
+    <w:p>
+      <w:pPr>
+        <w:spacing w:after="120" w:line="276"/>
+      </w:pPr>
+      <w:r>
+        <w:rPr>
+          <w:rFonts w:ascii="Arial" w:cs="Arial" w:eastAsia="Arial" w:hAnsi="Arial"/>
+          <w:b/>
+          <w:bCs/>
+        </w:rPr>
+        <w:t xml:space="preserve">Qué es: </w:t>
+      </w:r>
+      <w:r>
+        <w:rPr>
+          <w:rFonts w:ascii="Arial" w:cs="Arial" w:eastAsia="Arial" w:hAnsi="Arial"/>
+        </w:rPr>
+        <w:t xml:space="preserve">sobre el pipeline avanzado se añaden las prácticas que distinguen a un equipo senior/experto con Jenkins: pipeline reutilizable, configuración reproducible, despliegue seguro y secretos centralizados.</w:t>
+      </w:r>
+    </w:p>
+    <w:p>
+      <w:pPr>
+        <w:pStyle w:val="ListParagraph"/>
+        <w:numPr>
+          <w:ilvl w:val="0"/>
+          <w:numId w:val="2"/>
+        </w:numPr>
+        <w:spacing w:after="80" w:line="268"/>
+      </w:pPr>
+      <w:r>
+        <w:rPr>
+          <w:rFonts w:ascii="Arial" w:cs="Arial" w:eastAsia="Arial" w:hAnsi="Arial"/>
+          <w:b/>
+          <w:bCs/>
+        </w:rPr>
+        <w:t xml:space="preserve">Shared Library: </w:t>
+      </w:r>
+      <w:r>
+        <w:rPr>
+          <w:rFonts w:ascii="Arial" w:cs="Arial" w:eastAsia="Arial" w:hAnsi="Arial"/>
+        </w:rPr>
+        <w:t xml:space="preserve">toda la lógica del pipeline vive en una librería Groovy versionada (</w:t>
+      </w:r>
+      <w:r>
+        <w:rPr>
+          <w:rFonts w:ascii="Consolas" w:cs="Consolas" w:eastAsia="Consolas" w:hAnsi="Consolas"/>
+          <w:color w:val="4F46E5"/>
+        </w:rPr>
+        <w:t xml:space="preserve">jenkins-shared-library/</w:t>
+      </w:r>
+      <w:r>
+        <w:rPr>
+          <w:rFonts w:ascii="Arial" w:cs="Arial" w:eastAsia="Arial" w:hAnsi="Arial"/>
+        </w:rPr>
+        <w:t xml:space="preserve">: </w:t>
+      </w:r>
+      <w:r>
+        <w:rPr>
+          <w:rFonts w:ascii="Consolas" w:cs="Consolas" w:eastAsia="Consolas" w:hAnsi="Consolas"/>
+          <w:color w:val="4F46E5"/>
+        </w:rPr>
+        <w:t xml:space="preserve">vars/bookplusPipeline.groovy</w:t>
+      </w:r>
+      <w:r>
+        <w:rPr>
+          <w:rFonts w:ascii="Arial" w:cs="Arial" w:eastAsia="Arial" w:hAnsi="Arial"/>
+        </w:rPr>
+        <w:t xml:space="preserve">, </w:t>
+      </w:r>
+      <w:r>
+        <w:rPr>
+          <w:rFonts w:ascii="Consolas" w:cs="Consolas" w:eastAsia="Consolas" w:hAnsi="Consolas"/>
+          <w:color w:val="4F46E5"/>
+        </w:rPr>
+        <w:t xml:space="preserve">notify.groovy</w:t>
+      </w:r>
+      <w:r>
+        <w:rPr>
+          <w:rFonts w:ascii="Arial" w:cs="Arial" w:eastAsia="Arial" w:hAnsi="Arial"/>
+        </w:rPr>
+        <w:t xml:space="preserve">, </w:t>
+      </w:r>
+      <w:r>
+        <w:rPr>
+          <w:rFonts w:ascii="Consolas" w:cs="Consolas" w:eastAsia="Consolas" w:hAnsi="Consolas"/>
+          <w:color w:val="4F46E5"/>
+        </w:rPr>
+        <w:t xml:space="preserve">blueGreenDeploy.groovy</w:t>
+      </w:r>
+      <w:r>
+        <w:rPr>
+          <w:rFonts w:ascii="Arial" w:cs="Arial" w:eastAsia="Arial" w:hAnsi="Arial"/>
+        </w:rPr>
+        <w:t xml:space="preserve">, </w:t>
+      </w:r>
+      <w:r>
+        <w:rPr>
+          <w:rFonts w:ascii="Consolas" w:cs="Consolas" w:eastAsia="Consolas" w:hAnsi="Consolas"/>
+          <w:color w:val="4F46E5"/>
+        </w:rPr>
+        <w:t xml:space="preserve">src/.../Services.groovy</w:t>
+      </w:r>
+      <w:r>
+        <w:rPr>
+          <w:rFonts w:ascii="Arial" w:cs="Arial" w:eastAsia="Arial" w:hAnsi="Arial"/>
+        </w:rPr>
+        <w:t xml:space="preserve">), así el Jenkinsfile de cada repo queda en ~10 líneas (</w:t>
+      </w:r>
+      <w:r>
+        <w:rPr>
+          <w:rFonts w:ascii="Consolas" w:cs="Consolas" w:eastAsia="Consolas" w:hAnsi="Consolas"/>
+          <w:color w:val="4F46E5"/>
+        </w:rPr>
+        <w:t xml:space="preserve">@Library + bookplusPipeline(...)</w:t>
+      </w:r>
+      <w:r>
+        <w:rPr>
+          <w:rFonts w:ascii="Arial" w:cs="Arial" w:eastAsia="Arial" w:hAnsi="Arial"/>
+        </w:rPr>
+        <w:t xml:space="preserve">). Las mejoras se hacen una vez y las heredan todos los repos.</w:t>
+      </w:r>
+    </w:p>
+    <w:p>
+      <w:pPr>
+        <w:pStyle w:val="ListParagraph"/>
+        <w:numPr>
+          <w:ilvl w:val="0"/>
+          <w:numId w:val="2"/>
+        </w:numPr>
+        <w:spacing w:after="80" w:line="268"/>
+      </w:pPr>
+      <w:r>
+        <w:rPr>
+          <w:rFonts w:ascii="Arial" w:cs="Arial" w:eastAsia="Arial" w:hAnsi="Arial"/>
+          <w:b/>
+          <w:bCs/>
+        </w:rPr>
+        <w:t xml:space="preserve">JCasC (Configuration as Code): </w:t>
+      </w:r>
+      <w:r>
+        <w:rPr>
+          <w:rFonts w:ascii="Consolas" w:cs="Consolas" w:eastAsia="Consolas" w:hAnsi="Consolas"/>
+          <w:color w:val="4F46E5"/>
+        </w:rPr>
+        <w:t xml:space="preserve">jenkins/casc/jenkins.yaml</w:t>
+      </w:r>
+      <w:r>
+        <w:rPr>
+          <w:rFonts w:ascii="Arial" w:cs="Arial" w:eastAsia="Arial" w:hAnsi="Arial"/>
+        </w:rPr>
+        <w:t xml:space="preserve"> define TODA la configuración de Jenkins (seguridad, credenciales, la Shared Library, SonarCloud, Vault, Slack y el job). Con el asistente desactivado, Jenkins arranca ya configurado y reproducible, sin clicar nada; los secretos llegan por variables de entorno, no se hardcodean.</w:t>
+      </w:r>
+    </w:p>
+    <w:p>
+      <w:pPr>
+        <w:pStyle w:val="ListParagraph"/>
+        <w:numPr>
+          <w:ilvl w:val="0"/>
+          <w:numId w:val="2"/>
+        </w:numPr>
+        <w:spacing w:after="80" w:line="268"/>
+      </w:pPr>
+      <w:r>
+        <w:rPr>
+          <w:rFonts w:ascii="Arial" w:cs="Arial" w:eastAsia="Arial" w:hAnsi="Arial"/>
+          <w:b/>
+          <w:bCs/>
+        </w:rPr>
+        <w:t xml:space="preserve">Multibranch + PRs: </w:t>
+      </w:r>
+      <w:r>
+        <w:rPr>
+          <w:rFonts w:ascii="Arial" w:cs="Arial" w:eastAsia="Arial" w:hAnsi="Arial"/>
+        </w:rPr>
+        <w:t xml:space="preserve">el job se crea por código (job-dsl) como Multibranch Pipeline: construye automáticamente cada rama y Pull Request y limpia las ramas borradas.</w:t>
+      </w:r>
+    </w:p>
+    <w:p>
+      <w:pPr>
+        <w:pStyle w:val="ListParagraph"/>
+        <w:numPr>
+          <w:ilvl w:val="0"/>
+          <w:numId w:val="2"/>
+        </w:numPr>
+        <w:spacing w:after="80" w:line="268"/>
+      </w:pPr>
+      <w:r>
+        <w:rPr>
+          <w:rFonts w:ascii="Arial" w:cs="Arial" w:eastAsia="Arial" w:hAnsi="Arial"/>
+          <w:b/>
+          <w:bCs/>
+        </w:rPr>
+        <w:t xml:space="preserve">Despliegue blue-green con rollback: </w:t>
+      </w:r>
+      <w:r>
+        <w:rPr>
+          <w:rFonts w:ascii="Consolas" w:cs="Consolas" w:eastAsia="Consolas" w:hAnsi="Consolas"/>
+          <w:color w:val="4F46E5"/>
+        </w:rPr>
+        <w:t xml:space="preserve">blueGreenDeploy.groovy</w:t>
+      </w:r>
+      <w:r>
+        <w:rPr>
+          <w:rFonts w:ascii="Arial" w:cs="Arial" w:eastAsia="Arial" w:hAnsi="Arial"/>
+        </w:rPr>
+        <w:t xml:space="preserve"> despliega la versión nueva en el color inactivo, hace health check y solo entonces conmuta el tráfico; si falla, revierte automáticamente al color anterior (cero downtime). Con aprobación manual y timeout antes de producción.</w:t>
+      </w:r>
+    </w:p>
+    <w:p>
+      <w:pPr>
+        <w:pStyle w:val="ListParagraph"/>
+        <w:numPr>
+          <w:ilvl w:val="0"/>
+          <w:numId w:val="2"/>
+        </w:numPr>
+        <w:spacing w:after="80" w:line="268"/>
+      </w:pPr>
+      <w:r>
+        <w:rPr>
+          <w:rFonts w:ascii="Arial" w:cs="Arial" w:eastAsia="Arial" w:hAnsi="Arial"/>
+          <w:b/>
+          <w:bCs/>
+        </w:rPr>
+        <w:t xml:space="preserve">Notificaciones: </w:t>
+      </w:r>
+      <w:r>
+        <w:rPr>
+          <w:rFonts w:ascii="Arial" w:cs="Arial" w:eastAsia="Arial" w:hAnsi="Arial"/>
+        </w:rPr>
+        <w:t xml:space="preserve">el bloque </w:t>
+      </w:r>
+      <w:r>
+        <w:rPr>
+          <w:rFonts w:ascii="Consolas" w:cs="Consolas" w:eastAsia="Consolas" w:hAnsi="Consolas"/>
+          <w:color w:val="4F46E5"/>
+        </w:rPr>
+        <w:t xml:space="preserve">post</w:t>
+      </w:r>
+      <w:r>
+        <w:rPr>
+          <w:rFonts w:ascii="Arial" w:cs="Arial" w:eastAsia="Arial" w:hAnsi="Arial"/>
+        </w:rPr>
+        <w:t xml:space="preserve"> llama a </w:t>
+      </w:r>
+      <w:r>
+        <w:rPr>
+          <w:rFonts w:ascii="Consolas" w:cs="Consolas" w:eastAsia="Consolas" w:hAnsi="Consolas"/>
+          <w:color w:val="4F46E5"/>
+        </w:rPr>
+        <w:t xml:space="preserve">notify(status)</w:t>
+      </w:r>
+      <w:r>
+        <w:rPr>
+          <w:rFonts w:ascii="Arial" w:cs="Arial" w:eastAsia="Arial" w:hAnsi="Arial"/>
+        </w:rPr>
+        <w:t xml:space="preserve"> → Slack y, en fallos, email; tolerante si no está configurado.</w:t>
+      </w:r>
+    </w:p>
+    <w:p>
+      <w:pPr>
+        <w:pStyle w:val="ListParagraph"/>
+        <w:numPr>
+          <w:ilvl w:val="0"/>
+          <w:numId w:val="2"/>
+        </w:numPr>
+        <w:spacing w:after="80" w:line="268"/>
+      </w:pPr>
+      <w:r>
+        <w:rPr>
+          <w:rFonts w:ascii="Arial" w:cs="Arial" w:eastAsia="Arial" w:hAnsi="Arial"/>
+          <w:b/>
+          <w:bCs/>
+        </w:rPr>
+        <w:t xml:space="preserve">Credenciales desde Vault: </w:t>
+      </w:r>
+      <w:r>
+        <w:rPr>
+          <w:rFonts w:ascii="Arial" w:cs="Arial" w:eastAsia="Arial" w:hAnsi="Arial"/>
+        </w:rPr>
+        <w:t xml:space="preserve">el plugin de HashiCorp Vault (configurado por JCasC con AppRole) permite leer secretos en tiempo de ejecución con </w:t>
+      </w:r>
+      <w:r>
+        <w:rPr>
+          <w:rFonts w:ascii="Consolas" w:cs="Consolas" w:eastAsia="Consolas" w:hAnsi="Consolas"/>
+          <w:color w:val="4F46E5"/>
+        </w:rPr>
+        <w:t xml:space="preserve">withVault</w:t>
+      </w:r>
+      <w:r>
+        <w:rPr>
+          <w:rFonts w:ascii="Arial" w:cs="Arial" w:eastAsia="Arial" w:hAnsi="Arial"/>
+        </w:rPr>
+        <w:t xml:space="preserve">, encajando con el Vault que ya usa el backend (secretos rotables y auditables, fuera de Jenkins).</w:t>
+      </w:r>
+    </w:p>
+    <w:p>
+      <w:pPr>
+        <w:spacing w:after="120" w:line="276"/>
+      </w:pPr>
+      <w:r>
+        <w:rPr>
+          <w:rFonts w:ascii="Arial" w:cs="Arial" w:eastAsia="Arial" w:hAnsi="Arial"/>
+          <w:b/>
+          <w:bCs/>
+        </w:rPr>
+        <w:t xml:space="preserve">Verificación: </w:t>
+      </w:r>
+      <w:r>
+        <w:rPr>
+          <w:rFonts w:ascii="Arial" w:cs="Arial" w:eastAsia="Arial" w:hAnsi="Arial"/>
+        </w:rPr>
+        <w:t xml:space="preserve">es configuración/infra (no hay unit test); se valida levantando Jenkins, que debe arrancar sin asistente y con el job y la librería ya configurados. Detalle en JENKINS-EXPERT.md.</w:t>
       </w:r>
     </w:p>
     <w:p>
@@ -15069,61 +15737,13 @@
           <w:b/>
           <w:bCs/>
         </w:rPr>
-        <w:t xml:space="preserve">gRPC: </w:t>
-      </w:r>
-      <w:r>
-        <w:rPr>
-          <w:rFonts w:ascii="Arial" w:cs="Arial" w:eastAsia="Arial" w:hAnsi="Arial"/>
-        </w:rPr>
-        <w:t xml:space="preserve">comunicación interna contract-first con Protobuf.</w:t>
-      </w:r>
-    </w:p>
-    <w:p>
-      <w:pPr>
-        <w:pStyle w:val="ListParagraph"/>
-        <w:numPr>
-          <w:ilvl w:val="0"/>
-          <w:numId w:val="2"/>
-        </w:numPr>
-        <w:spacing w:after="80" w:line="268"/>
-      </w:pPr>
-      <w:r>
-        <w:rPr>
-          <w:rFonts w:ascii="Arial" w:cs="Arial" w:eastAsia="Arial" w:hAnsi="Arial"/>
-          <w:b/>
-          <w:bCs/>
-        </w:rPr>
-        <w:t xml:space="preserve">GraphQL (Spring for GraphQL): </w:t>
-      </w:r>
-      <w:r>
-        <w:rPr>
-          <w:rFonts w:ascii="Arial" w:cs="Arial" w:eastAsia="Arial" w:hAnsi="Arial"/>
-        </w:rPr>
-        <w:t xml:space="preserve">API de agregación para el frontend.</w:t>
-      </w:r>
-    </w:p>
-    <w:p>
-      <w:pPr>
-        <w:pStyle w:val="ListParagraph"/>
-        <w:numPr>
-          <w:ilvl w:val="0"/>
-          <w:numId w:val="2"/>
-        </w:numPr>
-        <w:spacing w:after="80" w:line="268"/>
-      </w:pPr>
-      <w:r>
-        <w:rPr>
-          <w:rFonts w:ascii="Arial" w:cs="Arial" w:eastAsia="Arial" w:hAnsi="Arial"/>
-          <w:b/>
-          <w:bCs/>
-        </w:rPr>
-        <w:t xml:space="preserve">Event Sourcing completo: </w:t>
-      </w:r>
-      <w:r>
-        <w:rPr>
-          <w:rFonts w:ascii="Arial" w:cs="Arial" w:eastAsia="Arial" w:hAnsi="Arial"/>
-        </w:rPr>
-        <w:t xml:space="preserve">con un event store en un agregado como el pedido.</w:t>
+        <w:t xml:space="preserve">Kubernetes: </w:t>
+      </w:r>
+      <w:r>
+        <w:rPr>
+          <w:rFonts w:ascii="Arial" w:cs="Arial" w:eastAsia="Arial" w:hAnsi="Arial"/>
+        </w:rPr>
+        <w:t xml:space="preserve">orquestación con probes, HPA, secrets e ingress.</w:t>
       </w:r>
     </w:p>
     <w:p>

</xml_diff>